<commit_message>
Update report format and exact variant 8 terminology
</commit_message>
<xml_diff>
--- a/Lab_01/Lab №1 Професійний Python.docx
+++ b/Lab_01/Lab №1 Професійний Python.docx
@@ -4,37 +4,28 @@
   <w:body>
     <w:p>
       <w:pPr>
-        <w:spacing w:before="0" w:after="40"/>
+        <w:spacing w:before="0" w:after="480" w:line="276" w:lineRule="auto"/>
         <w:jc w:val="center"/>
       </w:pPr>
       <w:r>
         <w:rPr>
+          <w:rFonts w:ascii="Times New Roman" w:hAnsi="Times New Roman"/>
           <w:b/>
-          <w:sz w:val="26"/>
         </w:rPr>
-        <w:t>ЛЬВІВСЬКИЙ НАЦІОНАЛЬНИЙ УНІВЕРСИТЕТ</w:t>
-        <w:br/>
-        <w:t>ІМЕНІ ІВАНА ФРАНКА</w:t>
+        <w:t>ЛЬВІВСЬКИЙ НАЦІОНАЛЬНИЙ УНІВЕРСИТЕТ ІМЕНІ ІВАНА ФРАНКА</w:t>
       </w:r>
     </w:p>
     <w:p>
       <w:pPr>
-        <w:spacing w:after="600"/>
-      </w:pPr>
-    </w:p>
-    <w:p>
-      <w:pPr>
-        <w:spacing w:before="0" w:after="40"/>
+        <w:spacing w:before="0" w:after="240" w:line="276" w:lineRule="auto"/>
         <w:jc w:val="center"/>
       </w:pPr>
       <w:r>
         <w:rPr>
+          <w:rFonts w:ascii="Times New Roman" w:hAnsi="Times New Roman"/>
           <w:b/>
-          <w:sz w:val="26"/>
         </w:rPr>
-        <w:t>ЗВІТ</w:t>
-        <w:br/>
-        <w:t>ДО ЛАБОРАТОРНОЇ РОБОТИ №1</w:t>
+        <w:t>ЗВІТ ДО ЛАБОРАТОРНОЇ РОБОТИ №1</w:t>
         <w:br/>
         <w:t>«Організація професійного Python-проєкту та Git»</w:t>
         <w:br/>
@@ -43,28 +34,27 @@
     </w:p>
     <w:p>
       <w:pPr>
-        <w:spacing w:before="0" w:after="40"/>
+        <w:spacing w:before="0" w:after="800" w:line="276" w:lineRule="auto"/>
         <w:jc w:val="center"/>
       </w:pPr>
       <w:r>
         <w:rPr>
+          <w:rFonts w:ascii="Times New Roman" w:hAnsi="Times New Roman"/>
           <w:b/>
-          <w:sz w:val="26"/>
         </w:rPr>
         <w:t>Варіант №8 — «Система бронювання готелю»</w:t>
       </w:r>
     </w:p>
     <w:p>
       <w:pPr>
-        <w:spacing w:after="1200"/>
-      </w:pPr>
-    </w:p>
-    <w:p>
-      <w:pPr>
-        <w:spacing w:line="288" w:lineRule="auto"/>
+        <w:spacing w:before="0" w:after="1600" w:line="276" w:lineRule="auto"/>
         <w:jc w:val="right"/>
       </w:pPr>
       <w:r>
+        <w:rPr>
+          <w:rFonts w:ascii="Times New Roman" w:hAnsi="Times New Roman"/>
+          <w:b w:val="0"/>
+        </w:rPr>
         <w:t>Виконав: студент 3 курсу</w:t>
         <w:br/>
         <w:t>групи ФеП-32</w:t>
@@ -77,20 +67,16 @@
         <w:t>Куньо Іван Михайлович</w:t>
         <w:br/>
         <w:t>Дата: 14.09.2026</w:t>
-        <w:br/>
       </w:r>
     </w:p>
     <w:p>
       <w:pPr>
-        <w:spacing w:after="1600"/>
-      </w:pPr>
-    </w:p>
-    <w:p>
-      <w:pPr>
+        <w:spacing w:before="0" w:after="80" w:line="276" w:lineRule="auto"/>
         <w:jc w:val="center"/>
       </w:pPr>
       <w:r>
         <w:rPr>
+          <w:rFonts w:ascii="Times New Roman" w:hAnsi="Times New Roman"/>
           <w:b/>
         </w:rPr>
         <w:t>Львів — 2026</w:t>
@@ -103,1149 +89,813 @@
     </w:p>
     <w:p>
       <w:pPr>
-        <w:spacing w:before="240" w:after="80"/>
+        <w:spacing w:before="200" w:after="80" w:line="276" w:lineRule="auto"/>
+        <w:jc w:val="both"/>
       </w:pPr>
       <w:r>
         <w:rPr>
+          <w:rFonts w:ascii="Times New Roman" w:hAnsi="Times New Roman"/>
           <w:b/>
-          <w:sz w:val="26"/>
         </w:rPr>
         <w:t>1. Мета роботи</w:t>
       </w:r>
     </w:p>
     <w:p>
       <w:pPr>
-        <w:spacing w:after="80" w:line="276" w:lineRule="auto"/>
+        <w:spacing w:before="0" w:after="80" w:line="276" w:lineRule="auto"/>
         <w:jc w:val="both"/>
       </w:pPr>
       <w:r>
+        <w:rPr>
+          <w:rFonts w:ascii="Times New Roman" w:hAnsi="Times New Roman"/>
+          <w:b w:val="0"/>
+        </w:rPr>
         <w:t>Ознайомитися з основними принципами організації професійного Python-проєкту, навчитися створювати ізольоване середовище розробки, використовувати src-layout, модулі та пакети Python, файл pyproject.toml, Git і базову документацію. Практично реалізувати консольний застосунок за індивідуальним варіантом №8.</w:t>
       </w:r>
     </w:p>
     <w:p>
       <w:pPr>
-        <w:spacing w:before="240" w:after="80"/>
+        <w:spacing w:before="200" w:after="80" w:line="276" w:lineRule="auto"/>
+        <w:jc w:val="both"/>
       </w:pPr>
       <w:r>
         <w:rPr>
+          <w:rFonts w:ascii="Times New Roman" w:hAnsi="Times New Roman"/>
           <w:b/>
-          <w:sz w:val="26"/>
         </w:rPr>
         <w:t>2. Індивідуальний варіант і постановка задачі</w:t>
       </w:r>
     </w:p>
     <w:p>
       <w:pPr>
-        <w:spacing w:after="80" w:line="276" w:lineRule="auto"/>
+        <w:spacing w:before="0" w:after="80" w:line="276" w:lineRule="auto"/>
         <w:jc w:val="both"/>
       </w:pPr>
       <w:r>
-        <w:t>Варіант 8. Система бронювання готелю. Для номера зберігати: номер (room number), тип (room type), ціна (price), статус бронювання (booking status). Реалізувати: список вільних номерів (available rooms), бронювання (booking), скасування бронювання (cancel booking), пошук найдешевшого номера (cheapest room), обчислення можливої виручки (potential revenue). Програма реалізує валідацію вхідних даних, кастомні винятки, консольне меню, структуру src-layout, type hints, pyproject.toml, .gitignore, README.md та Git repository.</w:t>
+        <w:rPr>
+          <w:rFonts w:ascii="Times New Roman" w:hAnsi="Times New Roman"/>
+          <w:b w:val="0"/>
+        </w:rPr>
+        <w:t>Варіант 8. Система бронювання готелю. Для номера зберігати: номер, тип, ціна, статус бронювання. Реалізувати: список вільних номерів, бронювання, скасування бронювання, пошук найдешевшого номера, обчислення можливої виручки.</w:t>
       </w:r>
     </w:p>
     <w:p>
       <w:pPr>
-        <w:spacing w:before="240" w:after="80"/>
+        <w:spacing w:before="0" w:after="80" w:line="276" w:lineRule="auto"/>
+        <w:jc w:val="both"/>
       </w:pPr>
       <w:r>
         <w:rPr>
+          <w:rFonts w:ascii="Times New Roman" w:hAnsi="Times New Roman"/>
+          <w:b w:val="0"/>
+        </w:rPr>
+        <w:t>Програма повинна мати структуру src-layout, містити щонайменше три Python modules, щонайменше одну data model, окремий module з business logic, main.py, використовувати type hints, містити щонайменше три функції, приймати декілька вхідних значень, виконувати обробку даних, формувати зрозумілий результат, використовувати конструкцію if __name__ == '__main__':, мати README.md, мати .gitignore, мати pyproject.toml, бути доданою до Git repository.</w:t>
+      </w:r>
+    </w:p>
+    <w:p>
+      <w:pPr>
+        <w:spacing w:before="200" w:after="80" w:line="276" w:lineRule="auto"/>
+        <w:jc w:val="both"/>
+      </w:pPr>
+      <w:r>
+        <w:rPr>
+          <w:rFonts w:ascii="Times New Roman" w:hAnsi="Times New Roman"/>
           <w:b/>
-          <w:sz w:val="26"/>
         </w:rPr>
         <w:t>3. Структура проєкту</w:t>
       </w:r>
     </w:p>
     <w:p>
       <w:pPr>
-        <w:spacing w:after="80" w:line="276" w:lineRule="auto"/>
-        <w:jc w:val="both"/>
+        <w:spacing w:before="40" w:after="80" w:line="240" w:lineRule="auto"/>
       </w:pPr>
       <w:r>
-        <w:t>Проєкт реалізовано за стандартом src-layout у каталозі Lab_01 з чітким розділенням на модулі:</w:t>
-      </w:r>
-    </w:p>
-    <w:tbl>
-      <w:tblPr>
-        <w:tblW w:type="auto" w:w="0"/>
-        <w:jc w:val="center"/>
-        <w:tblLook w:firstColumn="1" w:firstRow="1" w:lastColumn="0" w:lastRow="0" w:noHBand="0" w:noVBand="1" w:val="04A0"/>
-      </w:tblPr>
-      <w:tblGrid>
-        <w:gridCol w:w="9936"/>
-      </w:tblGrid>
-      <w:tr>
-        <w:tc>
-          <w:tcPr>
-            <w:tcW w:type="dxa" w:w="9936"/>
-            <w:shd w:fill="F4F5F7"/>
-            <w:tcBorders>
-              <w:top w:val="single" w:sz="4" w:space="0" w:color="D1D5DB"/>
-              <w:left w:val="single" w:sz="4" w:space="0" w:color="D1D5DB"/>
-              <w:bottom w:val="single" w:sz="4" w:space="0" w:color="D1D5DB"/>
-              <w:right w:val="single" w:sz="4" w:space="0" w:color="D1D5DB"/>
-            </w:tcBorders>
-          </w:tcPr>
-          <w:p>
-            <w:pPr>
-              <w:spacing w:before="40" w:after="40" w:line="240" w:lineRule="auto"/>
-            </w:pPr>
-            <w:r>
-              <w:rPr>
-                <w:rFonts w:ascii="Consolas" w:hAnsi="Consolas"/>
-                <w:sz w:val="19"/>
-              </w:rPr>
-              <w:t>hotel_booking/</w:t>
-              <w:br/>
-              <w:t xml:space="preserve">    ├── pyproject.toml</w:t>
-              <w:br/>
-              <w:t xml:space="preserve">    ├── README.md</w:t>
-              <w:br/>
-              <w:t xml:space="preserve">    ├── .gitignore</w:t>
-              <w:br/>
-              <w:t xml:space="preserve">    └── src/</w:t>
-              <w:br/>
-              <w:t xml:space="preserve">        └── hotel_booking/</w:t>
-              <w:br/>
-              <w:t xml:space="preserve">            ├── __init__.py</w:t>
-              <w:br/>
-              <w:t xml:space="preserve">            ├── main.py</w:t>
-              <w:br/>
-              <w:t xml:space="preserve">            ├── models.py</w:t>
-              <w:br/>
-              <w:t xml:space="preserve">            └── services.py</w:t>
-            </w:r>
-          </w:p>
-        </w:tc>
-      </w:tr>
-    </w:tbl>
-    <w:p>
-      <w:pPr>
-        <w:spacing w:after="40"/>
-      </w:pPr>
-    </w:p>
-    <w:p>
-      <w:pPr>
-        <w:spacing w:after="80" w:line="276" w:lineRule="auto"/>
-        <w:jc w:val="both"/>
-      </w:pPr>
-      <w:r>
-        <w:t>Каталог src/hotel_booking містить пакет системи бронювання готелю. Файл models.py описує data model Room та виняток BookingError, services.py реалізує business logic (список вільних номерів, бронювання, скасування бронювання, пошук найдешевшого номера, обчислення можливої виручки), а main.py забезпечує інтерфейс консольного меню та точку входу.</w:t>
+        <w:rPr>
+          <w:rFonts w:ascii="Courier New" w:hAnsi="Courier New"/>
+          <w:sz w:val="20"/>
+        </w:rPr>
+        <w:t>hotel_booking/</w:t>
+        <w:br/>
+        <w:t>├── pyproject.toml</w:t>
+        <w:br/>
+        <w:t>├── README.md</w:t>
+        <w:br/>
+        <w:t>├── .gitignore</w:t>
+        <w:br/>
+        <w:t>└── src/</w:t>
+        <w:br/>
+        <w:t xml:space="preserve">    └── hotel_booking/</w:t>
+        <w:br/>
+        <w:t xml:space="preserve">        ├── __init__.py</w:t>
+        <w:br/>
+        <w:t xml:space="preserve">        ├── main.py</w:t>
+        <w:br/>
+        <w:t xml:space="preserve">        ├── models.py</w:t>
+        <w:br/>
+        <w:t xml:space="preserve">        └── services.py</w:t>
       </w:r>
     </w:p>
     <w:p>
       <w:pPr>
-        <w:spacing w:before="240" w:after="80"/>
+        <w:spacing w:before="0" w:after="80" w:line="276" w:lineRule="auto"/>
+        <w:jc w:val="both"/>
       </w:pPr>
       <w:r>
         <w:rPr>
+          <w:rFonts w:ascii="Times New Roman" w:hAnsi="Times New Roman"/>
+          <w:b w:val="0"/>
+        </w:rPr>
+        <w:t>Каталог src/hotel_booking містить пакет програми система бронювання готелю. Файл models.py описує номер, тип, ціна, статус бронювання. Файл services.py реалізує список вільних номерів, бронювання, скасування бронювання, пошук найдешевшого номера, обчислення можливої виручки. Модуль main.py забезпечує запуск застосунку та консольне меню.</w:t>
+      </w:r>
+    </w:p>
+    <w:p>
+      <w:pPr>
+        <w:spacing w:before="200" w:after="80" w:line="276" w:lineRule="auto"/>
+        <w:jc w:val="both"/>
+      </w:pPr>
+      <w:r>
+        <w:rPr>
+          <w:rFonts w:ascii="Times New Roman" w:hAnsi="Times New Roman"/>
           <w:b/>
-          <w:sz w:val="26"/>
         </w:rPr>
         <w:t>4. Опис створених модулів</w:t>
       </w:r>
     </w:p>
     <w:p>
       <w:pPr>
-        <w:spacing w:before="160" w:after="40"/>
+        <w:spacing w:before="120" w:after="80" w:line="276" w:lineRule="auto"/>
+        <w:jc w:val="both"/>
       </w:pPr>
       <w:r>
         <w:rPr>
+          <w:rFonts w:ascii="Times New Roman" w:hAnsi="Times New Roman"/>
           <w:b/>
-          <w:sz w:val="24"/>
         </w:rPr>
         <w:t>4.1. models.py</w:t>
       </w:r>
     </w:p>
     <w:p>
       <w:pPr>
-        <w:spacing w:after="80" w:line="276" w:lineRule="auto"/>
+        <w:spacing w:before="0" w:after="80" w:line="276" w:lineRule="auto"/>
         <w:jc w:val="both"/>
       </w:pPr>
       <w:r>
-        <w:t>Для сутності готельного номера створено dataclass Room з обов'язковими атрибутами варіанта №8: номер (number), тип (room_type), ціна (price) та статус бронювання (is_booked). Для обробки помилок реалізовано власний клас винятку BookingError:</w:t>
+        <w:rPr>
+          <w:rFonts w:ascii="Times New Roman" w:hAnsi="Times New Roman"/>
+          <w:b w:val="0"/>
+        </w:rPr>
+        <w:t>У модулі models.py реалізовано data model Room для представлення сутності номера готелю з полями: номер (number), тип (room_type), ціна (price), статус бронювання (is_booked). Додано клас BookingError для обробки виняткових ситуацій під час бронювання номерів готелю.</w:t>
       </w:r>
-    </w:p>
-    <w:tbl>
-      <w:tblPr>
-        <w:tblW w:type="auto" w:w="0"/>
-        <w:jc w:val="center"/>
-        <w:tblLook w:firstColumn="1" w:firstRow="1" w:lastColumn="0" w:lastRow="0" w:noHBand="0" w:noVBand="1" w:val="04A0"/>
-      </w:tblPr>
-      <w:tblGrid>
-        <w:gridCol w:w="9936"/>
-      </w:tblGrid>
-      <w:tr>
-        <w:tc>
-          <w:tcPr>
-            <w:tcW w:type="dxa" w:w="9936"/>
-            <w:shd w:fill="F4F5F7"/>
-            <w:tcBorders>
-              <w:top w:val="single" w:sz="4" w:space="0" w:color="D1D5DB"/>
-              <w:left w:val="single" w:sz="4" w:space="0" w:color="D1D5DB"/>
-              <w:bottom w:val="single" w:sz="4" w:space="0" w:color="D1D5DB"/>
-              <w:right w:val="single" w:sz="4" w:space="0" w:color="D1D5DB"/>
-            </w:tcBorders>
-          </w:tcPr>
-          <w:p>
-            <w:pPr>
-              <w:spacing w:before="40" w:after="40" w:line="240" w:lineRule="auto"/>
-            </w:pPr>
-            <w:r>
-              <w:rPr>
-                <w:rFonts w:ascii="Consolas" w:hAnsi="Consolas"/>
-                <w:sz w:val="19"/>
-              </w:rPr>
-              <w:t>from dataclasses import dataclass</w:t>
-              <w:br/>
-              <w:t xml:space="preserve">    </w:t>
-              <w:br/>
-              <w:t xml:space="preserve">    class BookingError(Exception):</w:t>
-              <w:br/>
-              <w:t xml:space="preserve">        """Виняток для помилок операцій з бронюванням номерів готелю."""</w:t>
-              <w:br/>
-              <w:t xml:space="preserve">        pass</w:t>
-              <w:br/>
-              <w:t xml:space="preserve">    </w:t>
-              <w:br/>
-              <w:t xml:space="preserve">    @dataclass</w:t>
-              <w:br/>
-              <w:t xml:space="preserve">    class Room:</w:t>
-              <w:br/>
-              <w:t xml:space="preserve">        number: int</w:t>
-              <w:br/>
-              <w:t xml:space="preserve">        room_type: str</w:t>
-              <w:br/>
-              <w:t xml:space="preserve">        price: float</w:t>
-              <w:br/>
-              <w:t xml:space="preserve">        is_booked: bool = False</w:t>
-              <w:br/>
-              <w:t xml:space="preserve">    </w:t>
-              <w:br/>
-              <w:t xml:space="preserve">        @property</w:t>
-              <w:br/>
-              <w:t xml:space="preserve">        def status(self) -&gt; str:</w:t>
-              <w:br/>
-              <w:t xml:space="preserve">            return "Booked" if self.is_booked else "Available"</w:t>
-              <w:br/>
-              <w:t xml:space="preserve">    </w:t>
-              <w:br/>
-              <w:t xml:space="preserve">        def __str__(self) -&gt; str:</w:t>
-              <w:br/>
-              <w:t xml:space="preserve">            return f"Room #{self.number:&lt;4} | Type: {self.room_type:&lt;10} | Price: ${self.price:&lt;7.2f} | Status: {self.status}"</w:t>
-            </w:r>
-          </w:p>
-        </w:tc>
-      </w:tr>
-    </w:tbl>
-    <w:p>
-      <w:pPr>
-        <w:spacing w:after="40"/>
-      </w:pPr>
     </w:p>
     <w:p>
       <w:pPr>
-        <w:spacing w:before="160" w:after="40"/>
+        <w:spacing w:before="40" w:after="80" w:line="240" w:lineRule="auto"/>
       </w:pPr>
       <w:r>
         <w:rPr>
+          <w:rFonts w:ascii="Courier New" w:hAnsi="Courier New"/>
+          <w:sz w:val="20"/>
+        </w:rPr>
+        <w:t>from dataclasses import dataclass</w:t>
+        <w:br/>
+        <w:br/>
+        <w:t>class BookingError(Exception):</w:t>
+        <w:br/>
+        <w:t xml:space="preserve">    """Виняток для операцій бронювання."""</w:t>
+        <w:br/>
+        <w:t xml:space="preserve">    pass</w:t>
+        <w:br/>
+        <w:br/>
+        <w:t>@dataclass</w:t>
+        <w:br/>
+        <w:t>class Room:</w:t>
+        <w:br/>
+        <w:t xml:space="preserve">    number: int</w:t>
+        <w:br/>
+        <w:t xml:space="preserve">    room_type: str</w:t>
+        <w:br/>
+        <w:t xml:space="preserve">    price: float</w:t>
+        <w:br/>
+        <w:t xml:space="preserve">    is_booked: bool = False</w:t>
+        <w:br/>
+        <w:br/>
+        <w:t xml:space="preserve">    @property</w:t>
+        <w:br/>
+        <w:t xml:space="preserve">    def status(self) -&gt; str:</w:t>
+        <w:br/>
+        <w:t xml:space="preserve">        return "Booked" if self.is_booked else "Available"</w:t>
+        <w:br/>
+        <w:br/>
+        <w:t xml:space="preserve">    def __str__(self) -&gt; str:</w:t>
+        <w:br/>
+        <w:t xml:space="preserve">        return f"Номер: {self.number}, Тип: {self.room_type}, Ціна: {self.price}, Статус: {self.status}"</w:t>
+      </w:r>
+    </w:p>
+    <w:p>
+      <w:pPr>
+        <w:spacing w:before="120" w:after="80" w:line="276" w:lineRule="auto"/>
+        <w:jc w:val="both"/>
+      </w:pPr>
+      <w:r>
+        <w:rPr>
+          <w:rFonts w:ascii="Times New Roman" w:hAnsi="Times New Roman"/>
           <w:b/>
-          <w:sz w:val="24"/>
         </w:rPr>
         <w:t>4.2. services.py</w:t>
       </w:r>
     </w:p>
     <w:p>
       <w:pPr>
-        <w:spacing w:after="80" w:line="276" w:lineRule="auto"/>
+        <w:spacing w:before="0" w:after="80" w:line="276" w:lineRule="auto"/>
         <w:jc w:val="both"/>
       </w:pPr>
       <w:r>
-        <w:t>Модуль services.py містить бізнес-логіку системи бронювання готелю: 1) список вільних номерів (get_available_rooms); 2) пошук номера за його номером (find_room_by_number); 3) бронювання номера (book_room); 4) скасування бронювання (cancel_booking); 5) пошук найдешевшого номера серед доступних (find_cheapest_room); 6) обчислення можливої виручки готелю (calculate_potential_revenue):</w:t>
+        <w:rPr>
+          <w:rFonts w:ascii="Times New Roman" w:hAnsi="Times New Roman"/>
+          <w:b w:val="0"/>
+        </w:rPr>
+        <w:t>У модулі services.py реалізовано функції бізнес-логіки варіанта 8: список вільних номерів (get_available_rooms), бронювання номера (book_room), скасування бронювання (cancel_booking), пошук найдешевшого номера (find_cheapest_room), обчислення можливої виручки (calculate_potential_revenue), пошук номера за його значенням (find_room_by_number).</w:t>
       </w:r>
-    </w:p>
-    <w:tbl>
-      <w:tblPr>
-        <w:tblW w:type="auto" w:w="0"/>
-        <w:jc w:val="center"/>
-        <w:tblLook w:firstColumn="1" w:firstRow="1" w:lastColumn="0" w:lastRow="0" w:noHBand="0" w:noVBand="1" w:val="04A0"/>
-      </w:tblPr>
-      <w:tblGrid>
-        <w:gridCol w:w="9936"/>
-      </w:tblGrid>
-      <w:tr>
-        <w:tc>
-          <w:tcPr>
-            <w:tcW w:type="dxa" w:w="9936"/>
-            <w:shd w:fill="F4F5F7"/>
-            <w:tcBorders>
-              <w:top w:val="single" w:sz="4" w:space="0" w:color="D1D5DB"/>
-              <w:left w:val="single" w:sz="4" w:space="0" w:color="D1D5DB"/>
-              <w:bottom w:val="single" w:sz="4" w:space="0" w:color="D1D5DB"/>
-              <w:right w:val="single" w:sz="4" w:space="0" w:color="D1D5DB"/>
-            </w:tcBorders>
-          </w:tcPr>
-          <w:p>
-            <w:pPr>
-              <w:spacing w:before="40" w:after="40" w:line="240" w:lineRule="auto"/>
-            </w:pPr>
-            <w:r>
-              <w:rPr>
-                <w:rFonts w:ascii="Consolas" w:hAnsi="Consolas"/>
-                <w:sz w:val="19"/>
-              </w:rPr>
-              <w:t>from hotel_booking.models import BookingError, Room</w:t>
-              <w:br/>
-              <w:t xml:space="preserve">    </w:t>
-              <w:br/>
-              <w:t xml:space="preserve">    def get_available_rooms(rooms: list[Room]) -&gt; list[Room]:</w:t>
-              <w:br/>
-              <w:t xml:space="preserve">        """Повертає список вільних номерів готелю."""</w:t>
-              <w:br/>
-              <w:t xml:space="preserve">        return [room for room in rooms if not room.is_booked]</w:t>
-              <w:br/>
-              <w:t xml:space="preserve">    </w:t>
-              <w:br/>
-              <w:t xml:space="preserve">    def find_room_by_number(rooms: list[Room], number: int) -&gt; Room:</w:t>
-              <w:br/>
-              <w:t xml:space="preserve">        """Пошук номера готелю за номером."""</w:t>
-              <w:br/>
-              <w:t xml:space="preserve">        for room in rooms:</w:t>
-              <w:br/>
-              <w:t xml:space="preserve">            if room.number == number:</w:t>
-              <w:br/>
-              <w:t xml:space="preserve">                return room</w:t>
-              <w:br/>
-              <w:t xml:space="preserve">        raise BookingError(f"Room #{number} not found.")</w:t>
-              <w:br/>
-              <w:t xml:space="preserve">    </w:t>
-              <w:br/>
-              <w:t xml:space="preserve">    def book_room(rooms: list[Room], number: int) -&gt; Room:</w:t>
-              <w:br/>
-              <w:t xml:space="preserve">        """Бронювання номера готелю."""</w:t>
-              <w:br/>
-              <w:t xml:space="preserve">        room = find_room_by_number(rooms, number)</w:t>
-              <w:br/>
-              <w:t xml:space="preserve">        if room.is_booked:</w:t>
-              <w:br/>
-              <w:t xml:space="preserve">            raise BookingError(f"Room #{number} is already booked.")</w:t>
-              <w:br/>
-              <w:t xml:space="preserve">        room.is_booked = True</w:t>
-              <w:br/>
-              <w:t xml:space="preserve">        return room</w:t>
-              <w:br/>
-              <w:t xml:space="preserve">    </w:t>
-              <w:br/>
-              <w:t xml:space="preserve">    def cancel_booking(rooms: list[Room], number: int) -&gt; Room:</w:t>
-              <w:br/>
-              <w:t xml:space="preserve">        """Скасування бронювання номера."""</w:t>
-              <w:br/>
-              <w:t xml:space="preserve">        room = find_room_by_number(rooms, number)</w:t>
-              <w:br/>
-              <w:t xml:space="preserve">        if not room.is_booked:</w:t>
-              <w:br/>
-              <w:t xml:space="preserve">            raise BookingError(f"Room #{number} is not booked.")</w:t>
-              <w:br/>
-              <w:t xml:space="preserve">        room.is_booked = False</w:t>
-              <w:br/>
-              <w:t xml:space="preserve">        return room</w:t>
-              <w:br/>
-              <w:t xml:space="preserve">    </w:t>
-              <w:br/>
-              <w:t xml:space="preserve">    def find_cheapest_room(rooms: list[Room]) -&gt; Room | None:</w:t>
-              <w:br/>
-              <w:t xml:space="preserve">        """Пошук найдешевшого номера серед вільних."""</w:t>
-              <w:br/>
-              <w:t xml:space="preserve">        available = get_available_rooms(rooms)</w:t>
-              <w:br/>
-              <w:t xml:space="preserve">        if not available:</w:t>
-              <w:br/>
-              <w:t xml:space="preserve">            return None</w:t>
-              <w:br/>
-              <w:t xml:space="preserve">        return min(available, key=lambda room: room.price)</w:t>
-              <w:br/>
-              <w:t xml:space="preserve">    </w:t>
-              <w:br/>
-              <w:t xml:space="preserve">    def calculate_potential_revenue(rooms: list[Room]) -&gt; float:</w:t>
-              <w:br/>
-              <w:t xml:space="preserve">        """Обчислення можливої виручки заброньованих номерів готелю."""</w:t>
-              <w:br/>
-              <w:t xml:space="preserve">        return sum(room.price for room in rooms if room.is_booked)</w:t>
-            </w:r>
-          </w:p>
-        </w:tc>
-      </w:tr>
-    </w:tbl>
-    <w:p>
-      <w:pPr>
-        <w:spacing w:after="40"/>
-      </w:pPr>
     </w:p>
     <w:p>
       <w:pPr>
-        <w:spacing w:before="160" w:after="40"/>
+        <w:spacing w:before="40" w:after="80" w:line="240" w:lineRule="auto"/>
       </w:pPr>
       <w:r>
         <w:rPr>
+          <w:rFonts w:ascii="Courier New" w:hAnsi="Courier New"/>
+          <w:sz w:val="20"/>
+        </w:rPr>
+        <w:t>from hotel_booking.models import BookingError, Room</w:t>
+        <w:br/>
+        <w:br/>
+        <w:t>def get_available_rooms(rooms: list[Room]) -&gt; list[Room]:</w:t>
+        <w:br/>
+        <w:t xml:space="preserve">    """Список вільних номерів."""</w:t>
+        <w:br/>
+        <w:t xml:space="preserve">    return [room for room in rooms if not room.is_booked]</w:t>
+        <w:br/>
+        <w:br/>
+        <w:t>def find_room_by_number(rooms: list[Room], number: int) -&gt; Room:</w:t>
+        <w:br/>
+        <w:t xml:space="preserve">    """Пошук номера."""</w:t>
+        <w:br/>
+        <w:t xml:space="preserve">    for room in rooms:</w:t>
+        <w:br/>
+        <w:t xml:space="preserve">        if room.number == number:</w:t>
+        <w:br/>
+        <w:t xml:space="preserve">            return room</w:t>
+        <w:br/>
+        <w:t xml:space="preserve">    raise BookingError(f"Номер {number} не знайдено.")</w:t>
+        <w:br/>
+        <w:br/>
+        <w:t>def book_room(rooms: list[Room], number: int) -&gt; Room:</w:t>
+        <w:br/>
+        <w:t xml:space="preserve">    """Бронювання."""</w:t>
+        <w:br/>
+        <w:t xml:space="preserve">    room = find_room_by_number(rooms, number)</w:t>
+        <w:br/>
+        <w:t xml:space="preserve">    if room.is_booked:</w:t>
+        <w:br/>
+        <w:t xml:space="preserve">        raise BookingError(f"Номер {number} вже заброньовано.")</w:t>
+        <w:br/>
+        <w:t xml:space="preserve">    room.is_booked = True</w:t>
+        <w:br/>
+        <w:t xml:space="preserve">    return room</w:t>
+        <w:br/>
+        <w:br/>
+        <w:t>def cancel_booking(rooms: list[Room], number: int) -&gt; Room:</w:t>
+        <w:br/>
+        <w:t xml:space="preserve">    """Скасування бронювання."""</w:t>
+        <w:br/>
+        <w:t xml:space="preserve">    room = find_room_by_number(rooms, number)</w:t>
+        <w:br/>
+        <w:t xml:space="preserve">    if not room.is_booked:</w:t>
+        <w:br/>
+        <w:t xml:space="preserve">        raise BookingError(f"Номер {number} не заброньовано.")</w:t>
+        <w:br/>
+        <w:t xml:space="preserve">    room.is_booked = False</w:t>
+        <w:br/>
+        <w:t xml:space="preserve">    return room</w:t>
+        <w:br/>
+        <w:br/>
+        <w:t>def find_cheapest_room(rooms: list[Room]) -&gt; Room | None:</w:t>
+        <w:br/>
+        <w:t xml:space="preserve">    """Пошук найдешевшого номера."""</w:t>
+        <w:br/>
+        <w:t xml:space="preserve">    available = get_available_rooms(rooms)</w:t>
+        <w:br/>
+        <w:t xml:space="preserve">    if not available:</w:t>
+        <w:br/>
+        <w:t xml:space="preserve">        return None</w:t>
+        <w:br/>
+        <w:t xml:space="preserve">    return min(available, key=lambda room: room.price)</w:t>
+        <w:br/>
+        <w:br/>
+        <w:t>def calculate_potential_revenue(rooms: list[Room]) -&gt; float:</w:t>
+        <w:br/>
+        <w:t xml:space="preserve">    """Обчислення можливої виручки."""</w:t>
+        <w:br/>
+        <w:t xml:space="preserve">    return sum(room.price for room in rooms if room.is_booked)</w:t>
+      </w:r>
+    </w:p>
+    <w:p>
+      <w:pPr>
+        <w:spacing w:before="120" w:after="80" w:line="276" w:lineRule="auto"/>
+        <w:jc w:val="both"/>
+      </w:pPr>
+      <w:r>
+        <w:rPr>
+          <w:rFonts w:ascii="Times New Roman" w:hAnsi="Times New Roman"/>
           <w:b/>
-          <w:sz w:val="24"/>
         </w:rPr>
         <w:t>4.3. main.py</w:t>
       </w:r>
     </w:p>
     <w:p>
       <w:pPr>
-        <w:spacing w:after="80" w:line="276" w:lineRule="auto"/>
+        <w:spacing w:before="0" w:after="80" w:line="276" w:lineRule="auto"/>
         <w:jc w:val="both"/>
       </w:pPr>
       <w:r>
-        <w:t>Модуль main.py реалізує роботу системи бронювання готелю, консольне меню для виклику операцій (перегляд номерів, бронювання, скасування, пошук найдешевшого, виручка) та точку входу:</w:t>
+        <w:rPr>
+          <w:rFonts w:ascii="Times New Roman" w:hAnsi="Times New Roman"/>
+          <w:b w:val="0"/>
+        </w:rPr>
+        <w:t>Модуль main.py є точкою входу програми, створює список номерів готелю, забезпечує консольне меню для виклику операцій: список вільних номерів, бронювання, скасування бронювання, пошук найдешевшого номера, обчислення можливої виручки.</w:t>
       </w:r>
-    </w:p>
-    <w:tbl>
-      <w:tblPr>
-        <w:tblW w:type="auto" w:w="0"/>
-        <w:jc w:val="center"/>
-        <w:tblLook w:firstColumn="1" w:firstRow="1" w:lastColumn="0" w:lastRow="0" w:noHBand="0" w:noVBand="1" w:val="04A0"/>
-      </w:tblPr>
-      <w:tblGrid>
-        <w:gridCol w:w="9936"/>
-      </w:tblGrid>
-      <w:tr>
-        <w:tc>
-          <w:tcPr>
-            <w:tcW w:type="dxa" w:w="9936"/>
-            <w:shd w:fill="F4F5F7"/>
-            <w:tcBorders>
-              <w:top w:val="single" w:sz="4" w:space="0" w:color="D1D5DB"/>
-              <w:left w:val="single" w:sz="4" w:space="0" w:color="D1D5DB"/>
-              <w:bottom w:val="single" w:sz="4" w:space="0" w:color="D1D5DB"/>
-              <w:right w:val="single" w:sz="4" w:space="0" w:color="D1D5DB"/>
-            </w:tcBorders>
-          </w:tcPr>
-          <w:p>
-            <w:pPr>
-              <w:spacing w:before="40" w:after="40" w:line="240" w:lineRule="auto"/>
-            </w:pPr>
-            <w:r>
-              <w:rPr>
-                <w:rFonts w:ascii="Consolas" w:hAnsi="Consolas"/>
-                <w:sz w:val="19"/>
-              </w:rPr>
-              <w:t>from hotel_booking.models import BookingError, Room</w:t>
-              <w:br/>
-              <w:t xml:space="preserve">    from hotel_booking.services import (</w:t>
-              <w:br/>
-              <w:t xml:space="preserve">        book_room,</w:t>
-              <w:br/>
-              <w:t xml:space="preserve">        cancel_booking,</w:t>
-              <w:br/>
-              <w:t xml:space="preserve">        calculate_potential_revenue,</w:t>
-              <w:br/>
-              <w:t xml:space="preserve">        find_cheapest_room,</w:t>
-              <w:br/>
-              <w:t xml:space="preserve">        get_available_rooms,</w:t>
-              <w:br/>
-              <w:t xml:space="preserve">    )</w:t>
-              <w:br/>
-              <w:t xml:space="preserve">    </w:t>
-              <w:br/>
-              <w:t xml:space="preserve">    def create_demo_rooms() -&gt; list[Room]:</w:t>
-              <w:br/>
-              <w:t xml:space="preserve">        return [</w:t>
-              <w:br/>
-              <w:t xml:space="preserve">            Room(number=101, room_type="Standard", price=60.0, is_booked=False),</w:t>
-              <w:br/>
-              <w:t xml:space="preserve">            Room(number=102, room_type="Standard", price=75.0, is_booked=True),</w:t>
-              <w:br/>
-              <w:t xml:space="preserve">            Room(number=201, room_type="Deluxe", price=120.0, is_booked=False),</w:t>
-              <w:br/>
-              <w:t xml:space="preserve">            Room(number=202, room_type="Deluxe", price=110.0, is_booked=False),</w:t>
-              <w:br/>
-              <w:t xml:space="preserve">            Room(number=301, room_type="Suite", price=250.0, is_booked=True),</w:t>
-              <w:br/>
-              <w:t xml:space="preserve">        ]</w:t>
-              <w:br/>
-              <w:t xml:space="preserve">    </w:t>
-              <w:br/>
-              <w:t xml:space="preserve">    def print_rooms(rooms: list[Room], title: str = "Rooms") -&gt; None:</w:t>
-              <w:br/>
-              <w:t xml:space="preserve">        print(f"\n{title}:")</w:t>
-              <w:br/>
-              <w:t xml:space="preserve">        for room in rooms:</w:t>
-              <w:br/>
-              <w:t xml:space="preserve">            print(f"  {room}")</w:t>
-              <w:br/>
-              <w:t xml:space="preserve">    </w:t>
-              <w:br/>
-              <w:t xml:space="preserve">    def run_menu(rooms: list[Room]) -&gt; None:</w:t>
-              <w:br/>
-              <w:t xml:space="preserve">        while True:</w:t>
-              <w:br/>
-              <w:t xml:space="preserve">            choice = input("Select command (1-7): ").strip()</w:t>
-              <w:br/>
-              <w:t xml:space="preserve">            if choice == "1":</w:t>
-              <w:br/>
-              <w:t xml:space="preserve">                print_rooms(rooms, "All Hotel Rooms")</w:t>
-              <w:br/>
-              <w:t xml:space="preserve">            elif choice == "2":</w:t>
-              <w:br/>
-              <w:t xml:space="preserve">                print_rooms(get_available_rooms(rooms), "Available Rooms")</w:t>
-              <w:br/>
-              <w:t xml:space="preserve">            elif choice == "7":</w:t>
-              <w:br/>
-              <w:t xml:space="preserve">                break</w:t>
-              <w:br/>
-              <w:t xml:space="preserve">    </w:t>
-              <w:br/>
-              <w:t xml:space="preserve">    def main() -&gt; None:</w:t>
-              <w:br/>
-              <w:t xml:space="preserve">        rooms = create_demo_rooms()</w:t>
-              <w:br/>
-              <w:t xml:space="preserve">        run_menu(rooms)</w:t>
-              <w:br/>
-              <w:t xml:space="preserve">    </w:t>
-              <w:br/>
-              <w:t xml:space="preserve">    if __name__ == "__main__":</w:t>
-              <w:br/>
-              <w:t xml:space="preserve">        main()</w:t>
-            </w:r>
-          </w:p>
-        </w:tc>
-      </w:tr>
-    </w:tbl>
-    <w:p>
-      <w:pPr>
-        <w:spacing w:after="40"/>
-      </w:pPr>
     </w:p>
     <w:p>
       <w:pPr>
-        <w:spacing w:before="240" w:after="80"/>
+        <w:spacing w:before="40" w:after="80" w:line="240" w:lineRule="auto"/>
       </w:pPr>
       <w:r>
         <w:rPr>
+          <w:rFonts w:ascii="Courier New" w:hAnsi="Courier New"/>
+          <w:sz w:val="20"/>
+        </w:rPr>
+        <w:t>from hotel_booking.models import BookingError, Room</w:t>
+        <w:br/>
+        <w:t>from hotel_booking.services import (</w:t>
+        <w:br/>
+        <w:t xml:space="preserve">    book_room,</w:t>
+        <w:br/>
+        <w:t xml:space="preserve">    cancel_booking,</w:t>
+        <w:br/>
+        <w:t xml:space="preserve">    calculate_potential_revenue,</w:t>
+        <w:br/>
+        <w:t xml:space="preserve">    find_cheapest_room,</w:t>
+        <w:br/>
+        <w:t xml:space="preserve">    get_available_rooms,</w:t>
+        <w:br/>
+        <w:t>)</w:t>
+        <w:br/>
+        <w:br/>
+        <w:t>def create_demo_rooms() -&gt; list[Room]:</w:t>
+        <w:br/>
+        <w:t xml:space="preserve">    return [</w:t>
+        <w:br/>
+        <w:t xml:space="preserve">        Room(number=101, room_type="Standard", price=60.0, is_booked=False),</w:t>
+        <w:br/>
+        <w:t xml:space="preserve">        Room(number=102, room_type="Standard", price=75.0, is_booked=True),</w:t>
+        <w:br/>
+        <w:t xml:space="preserve">        Room(number=201, room_type="Deluxe", price=120.0, is_booked=False),</w:t>
+        <w:br/>
+        <w:t xml:space="preserve">        Room(number=202, room_type="Deluxe", price=110.0, is_booked=False),</w:t>
+        <w:br/>
+        <w:t xml:space="preserve">        Room(number=301, room_type="Suite", price=250.0, is_booked=True),</w:t>
+        <w:br/>
+        <w:t xml:space="preserve">    ]</w:t>
+        <w:br/>
+        <w:br/>
+        <w:t>def print_rooms(rooms: list[Room], title: str = "Номери готелю") -&gt; None:</w:t>
+        <w:br/>
+        <w:t xml:space="preserve">    print(f"\n{title}:")</w:t>
+        <w:br/>
+        <w:t xml:space="preserve">    for room in rooms:</w:t>
+        <w:br/>
+        <w:t xml:space="preserve">        print(f"  {room}")</w:t>
+        <w:br/>
+        <w:br/>
+        <w:t>def run_menu(rooms: list[Room]) -&gt; None:</w:t>
+        <w:br/>
+        <w:t xml:space="preserve">    while True:</w:t>
+        <w:br/>
+        <w:t xml:space="preserve">        print("\n1. Всі номери\n2. Список вільних номерів\n3. Бронювання\n4. Скасування бронювання\n5. Пошук найдешевшого номера\n6. Обчислення можливої виручки\n7. Вихід")</w:t>
+        <w:br/>
+        <w:t xml:space="preserve">        choice = input("Оберіть пункт: ").strip()</w:t>
+        <w:br/>
+        <w:t xml:space="preserve">        if choice == "1":</w:t>
+        <w:br/>
+        <w:t xml:space="preserve">            print_rooms(rooms, "Всі номери")</w:t>
+        <w:br/>
+        <w:t xml:space="preserve">        elif choice == "2":</w:t>
+        <w:br/>
+        <w:t xml:space="preserve">            print_rooms(get_available_rooms(rooms), "Список вільних номерів")</w:t>
+        <w:br/>
+        <w:t xml:space="preserve">        elif choice == "3":</w:t>
+        <w:br/>
+        <w:t xml:space="preserve">            num = int(input("Номер: "))</w:t>
+        <w:br/>
+        <w:t xml:space="preserve">            book_room(rooms, num)</w:t>
+        <w:br/>
+        <w:t xml:space="preserve">            print("Бронювання успішне.")</w:t>
+        <w:br/>
+        <w:t xml:space="preserve">        elif choice == "4":</w:t>
+        <w:br/>
+        <w:t xml:space="preserve">            num = int(input("Номер: "))</w:t>
+        <w:br/>
+        <w:t xml:space="preserve">            cancel_booking(rooms, num)</w:t>
+        <w:br/>
+        <w:t xml:space="preserve">            print("Скасування бронювання успішне.")</w:t>
+        <w:br/>
+        <w:t xml:space="preserve">        elif choice == "5":</w:t>
+        <w:br/>
+        <w:t xml:space="preserve">            ch = find_cheapest_room(rooms)</w:t>
+        <w:br/>
+        <w:t xml:space="preserve">            print(f"Пошук найдешевшого номера: {ch}")</w:t>
+        <w:br/>
+        <w:t xml:space="preserve">        elif choice == "6":</w:t>
+        <w:br/>
+        <w:t xml:space="preserve">            rev = calculate_potential_revenue(rooms)</w:t>
+        <w:br/>
+        <w:t xml:space="preserve">            print(f"Обчислення можливої виручки: {rev}")</w:t>
+        <w:br/>
+        <w:t xml:space="preserve">        elif choice == "7":</w:t>
+        <w:br/>
+        <w:t xml:space="preserve">            break</w:t>
+        <w:br/>
+        <w:br/>
+        <w:t>def main() -&gt; None:</w:t>
+        <w:br/>
+        <w:t xml:space="preserve">    rooms = create_demo_rooms()</w:t>
+        <w:br/>
+        <w:t xml:space="preserve">    run_menu(rooms)</w:t>
+        <w:br/>
+        <w:br/>
+        <w:t>if __name__ == "__main__":</w:t>
+        <w:br/>
+        <w:t xml:space="preserve">    main()</w:t>
+      </w:r>
+    </w:p>
+    <w:p>
+      <w:pPr>
+        <w:spacing w:before="200" w:after="80" w:line="276" w:lineRule="auto"/>
+        <w:jc w:val="both"/>
+      </w:pPr>
+      <w:r>
+        <w:rPr>
+          <w:rFonts w:ascii="Times New Roman" w:hAnsi="Times New Roman"/>
           <w:b/>
-          <w:sz w:val="26"/>
         </w:rPr>
         <w:t>5. Файл pyproject.toml</w:t>
       </w:r>
     </w:p>
     <w:p>
       <w:pPr>
-        <w:spacing w:after="80" w:line="276" w:lineRule="auto"/>
+        <w:spacing w:before="40" w:after="80" w:line="240" w:lineRule="auto"/>
+      </w:pPr>
+      <w:r>
+        <w:rPr>
+          <w:rFonts w:ascii="Courier New" w:hAnsi="Courier New"/>
+          <w:sz w:val="20"/>
+        </w:rPr>
+        <w:t>[build-system]</w:t>
+        <w:br/>
+        <w:t>requires = ["setuptools&gt;=70"]</w:t>
+        <w:br/>
+        <w:t>build-backend = "setuptools.build_meta"</w:t>
+        <w:br/>
+        <w:br/>
+        <w:t>[project]</w:t>
+        <w:br/>
+        <w:t>name = "hotel-booking"</w:t>
+        <w:br/>
+        <w:t>version = "0.1.0"</w:t>
+        <w:br/>
+        <w:t>description = "Система бронювання готелю"</w:t>
+        <w:br/>
+        <w:t>requires-python = "&gt;=3.11"</w:t>
+        <w:br/>
+        <w:br/>
+        <w:t>[project.scripts]</w:t>
+        <w:br/>
+        <w:t>hotel-booking = "hotel_booking.main:main"</w:t>
+      </w:r>
+    </w:p>
+    <w:p>
+      <w:pPr>
+        <w:spacing w:before="200" w:after="80" w:line="276" w:lineRule="auto"/>
         <w:jc w:val="both"/>
       </w:pPr>
       <w:r>
-        <w:t>Конфігурація проєкту «Система бронювання готелю» (hotel-booking):</w:t>
-      </w:r>
-    </w:p>
-    <w:tbl>
-      <w:tblPr>
-        <w:tblW w:type="auto" w:w="0"/>
-        <w:jc w:val="center"/>
-        <w:tblLook w:firstColumn="1" w:firstRow="1" w:lastColumn="0" w:lastRow="0" w:noHBand="0" w:noVBand="1" w:val="04A0"/>
-      </w:tblPr>
-      <w:tblGrid>
-        <w:gridCol w:w="9936"/>
-      </w:tblGrid>
-      <w:tr>
-        <w:tc>
-          <w:tcPr>
-            <w:tcW w:type="dxa" w:w="9936"/>
-            <w:shd w:fill="F4F5F7"/>
-            <w:tcBorders>
-              <w:top w:val="single" w:sz="4" w:space="0" w:color="D1D5DB"/>
-              <w:left w:val="single" w:sz="4" w:space="0" w:color="D1D5DB"/>
-              <w:bottom w:val="single" w:sz="4" w:space="0" w:color="D1D5DB"/>
-              <w:right w:val="single" w:sz="4" w:space="0" w:color="D1D5DB"/>
-            </w:tcBorders>
-          </w:tcPr>
-          <w:p>
-            <w:pPr>
-              <w:spacing w:before="40" w:after="40" w:line="240" w:lineRule="auto"/>
-            </w:pPr>
-            <w:r>
-              <w:rPr>
-                <w:rFonts w:ascii="Consolas" w:hAnsi="Consolas"/>
-                <w:sz w:val="19"/>
-              </w:rPr>
-              <w:t>[build-system]</w:t>
-              <w:br/>
-              <w:t xml:space="preserve">    requires = ["setuptools&gt;=70"]</w:t>
-              <w:br/>
-              <w:t xml:space="preserve">    build-backend = "setuptools.build_meta"</w:t>
-              <w:br/>
-              <w:t xml:space="preserve">    </w:t>
-              <w:br/>
-              <w:t xml:space="preserve">    [project]</w:t>
-              <w:br/>
-              <w:t xml:space="preserve">    name = "hotel-booking"</w:t>
-              <w:br/>
-              <w:t xml:space="preserve">    version = "0.1.0"</w:t>
-              <w:br/>
-              <w:t xml:space="preserve">    description = "Hotel booking system laboratory project"</w:t>
-              <w:br/>
-              <w:t xml:space="preserve">    requires-python = "&gt;=3.11"</w:t>
-              <w:br/>
-              <w:t xml:space="preserve">    </w:t>
-              <w:br/>
-              <w:t xml:space="preserve">    [project.scripts]</w:t>
-              <w:br/>
-              <w:t xml:space="preserve">    hotel-booking = "hotel_booking.main:main" </w:t>
-            </w:r>
-          </w:p>
-        </w:tc>
-      </w:tr>
-    </w:tbl>
-    <w:p>
-      <w:pPr>
-        <w:spacing w:after="40"/>
-      </w:pPr>
-    </w:p>
-    <w:p>
-      <w:pPr>
-        <w:spacing w:before="240" w:after="80"/>
-      </w:pPr>
-      <w:r>
         <w:rPr>
+          <w:rFonts w:ascii="Times New Roman" w:hAnsi="Times New Roman"/>
           <w:b/>
-          <w:sz w:val="26"/>
         </w:rPr>
         <w:t>6. Файл .gitignore</w:t>
       </w:r>
     </w:p>
-    <w:tbl>
-      <w:tblPr>
-        <w:tblW w:type="auto" w:w="0"/>
-        <w:jc w:val="center"/>
-        <w:tblLook w:firstColumn="1" w:firstRow="1" w:lastColumn="0" w:lastRow="0" w:noHBand="0" w:noVBand="1" w:val="04A0"/>
-      </w:tblPr>
-      <w:tblGrid>
-        <w:gridCol w:w="9936"/>
-      </w:tblGrid>
-      <w:tr>
-        <w:tc>
-          <w:tcPr>
-            <w:tcW w:type="dxa" w:w="9936"/>
-            <w:shd w:fill="F4F5F7"/>
-            <w:tcBorders>
-              <w:top w:val="single" w:sz="4" w:space="0" w:color="D1D5DB"/>
-              <w:left w:val="single" w:sz="4" w:space="0" w:color="D1D5DB"/>
-              <w:bottom w:val="single" w:sz="4" w:space="0" w:color="D1D5DB"/>
-              <w:right w:val="single" w:sz="4" w:space="0" w:color="D1D5DB"/>
-            </w:tcBorders>
-          </w:tcPr>
-          <w:p>
-            <w:pPr>
-              <w:spacing w:before="40" w:after="40" w:line="240" w:lineRule="auto"/>
-            </w:pPr>
-            <w:r>
-              <w:rPr>
-                <w:rFonts w:ascii="Consolas" w:hAnsi="Consolas"/>
-                <w:sz w:val="19"/>
-              </w:rPr>
-              <w:t>.venv/</w:t>
-              <w:br/>
-              <w:t xml:space="preserve">    __pycache__/</w:t>
-              <w:br/>
-              <w:t xml:space="preserve">    *.pyc</w:t>
-              <w:br/>
-              <w:t xml:space="preserve">    .pytest_cache/</w:t>
-              <w:br/>
-              <w:t xml:space="preserve">    .idea/</w:t>
-              <w:br/>
-              <w:t xml:space="preserve">    .vscode/</w:t>
-              <w:br/>
-              <w:t xml:space="preserve">    dist/</w:t>
-              <w:br/>
-              <w:t xml:space="preserve">    build/</w:t>
-              <w:br/>
-              <w:t xml:space="preserve">    *.egg-info/</w:t>
-              <w:br/>
-              <w:t xml:space="preserve">    .env</w:t>
-            </w:r>
-          </w:p>
-        </w:tc>
-      </w:tr>
-    </w:tbl>
     <w:p>
       <w:pPr>
-        <w:spacing w:after="40"/>
+        <w:spacing w:before="40" w:after="80" w:line="240" w:lineRule="auto"/>
       </w:pPr>
+      <w:r>
+        <w:rPr>
+          <w:rFonts w:ascii="Courier New" w:hAnsi="Courier New"/>
+          <w:sz w:val="20"/>
+        </w:rPr>
+        <w:t>.venv/</w:t>
+        <w:br/>
+        <w:t>__pycache__/</w:t>
+        <w:br/>
+        <w:t>*.pyc</w:t>
+        <w:br/>
+        <w:t>.pytest_cache/</w:t>
+        <w:br/>
+        <w:t>.idea/</w:t>
+        <w:br/>
+        <w:t>.vscode/</w:t>
+        <w:br/>
+        <w:t>dist/</w:t>
+        <w:br/>
+        <w:t>build/</w:t>
+        <w:br/>
+        <w:t>*.egg-info/</w:t>
+        <w:br/>
+        <w:t>.env</w:t>
+      </w:r>
     </w:p>
     <w:p>
       <w:pPr>
-        <w:spacing w:before="240" w:after="80"/>
+        <w:spacing w:before="200" w:after="80" w:line="276" w:lineRule="auto"/>
+        <w:jc w:val="both"/>
       </w:pPr>
       <w:r>
         <w:rPr>
+          <w:rFonts w:ascii="Times New Roman" w:hAnsi="Times New Roman"/>
           <w:b/>
-          <w:sz w:val="26"/>
         </w:rPr>
         <w:t>7. Фрагмент README.md</w:t>
       </w:r>
     </w:p>
-    <w:tbl>
-      <w:tblPr>
-        <w:tblW w:type="auto" w:w="0"/>
-        <w:jc w:val="center"/>
-        <w:tblLook w:firstColumn="1" w:firstRow="1" w:lastColumn="0" w:lastRow="0" w:noHBand="0" w:noVBand="1" w:val="04A0"/>
-      </w:tblPr>
-      <w:tblGrid>
-        <w:gridCol w:w="9936"/>
-      </w:tblGrid>
-      <w:tr>
-        <w:tc>
-          <w:tcPr>
-            <w:tcW w:type="dxa" w:w="9936"/>
-            <w:shd w:fill="F4F5F7"/>
-            <w:tcBorders>
-              <w:top w:val="single" w:sz="4" w:space="0" w:color="D1D5DB"/>
-              <w:left w:val="single" w:sz="4" w:space="0" w:color="D1D5DB"/>
-              <w:bottom w:val="single" w:sz="4" w:space="0" w:color="D1D5DB"/>
-              <w:right w:val="single" w:sz="4" w:space="0" w:color="D1D5DB"/>
-            </w:tcBorders>
-          </w:tcPr>
-          <w:p>
-            <w:pPr>
-              <w:spacing w:before="40" w:after="40" w:line="240" w:lineRule="auto"/>
-            </w:pPr>
-            <w:r>
-              <w:rPr>
-                <w:rFonts w:ascii="Consolas" w:hAnsi="Consolas"/>
-                <w:sz w:val="19"/>
-              </w:rPr>
-              <w:t># Hotel Booking System</w:t>
-              <w:br/>
-              <w:t xml:space="preserve">    Лабораторна робота №1: «Система бронювання готелю», Варіант №8.</w:t>
-              <w:br/>
-              <w:t xml:space="preserve">    </w:t>
-              <w:br/>
-              <w:t xml:space="preserve">    ## Requirements</w:t>
-              <w:br/>
-              <w:t xml:space="preserve">    Python 3.11+</w:t>
-              <w:br/>
-              <w:t xml:space="preserve">    </w:t>
-              <w:br/>
-              <w:t xml:space="preserve">    ## Installation</w:t>
-              <w:br/>
-              <w:t xml:space="preserve">    python -m venv .venv</w:t>
-              <w:br/>
-              <w:t xml:space="preserve">    .venv\Scripts\activate</w:t>
-              <w:br/>
-              <w:t xml:space="preserve">    python -m pip install -e .</w:t>
-              <w:br/>
-              <w:t xml:space="preserve">    </w:t>
-              <w:br/>
-              <w:t xml:space="preserve">    ## Run</w:t>
-              <w:br/>
-              <w:t xml:space="preserve">    python -m hotel_booking.main</w:t>
-              <w:br/>
-              <w:t xml:space="preserve">    # або через команду:</w:t>
-              <w:br/>
-              <w:t xml:space="preserve">    hotel-booking</w:t>
-            </w:r>
-          </w:p>
-        </w:tc>
-      </w:tr>
-    </w:tbl>
     <w:p>
       <w:pPr>
-        <w:spacing w:after="40"/>
+        <w:spacing w:before="40" w:after="80" w:line="240" w:lineRule="auto"/>
       </w:pPr>
+      <w:r>
+        <w:rPr>
+          <w:rFonts w:ascii="Courier New" w:hAnsi="Courier New"/>
+          <w:sz w:val="20"/>
+        </w:rPr>
+        <w:t># Система бронювання готелю</w:t>
+        <w:br/>
+        <w:t>Лабораторна робота №1 з курсу «Професійний Python», варіант №8.</w:t>
+        <w:br/>
+        <w:t>Номер, тип, ціна, статус бронювання.</w:t>
+        <w:br/>
+        <w:t>Функції: список вільних номерів, бронювання, скасування бронювання, пошук найдешевшого номера, обчислення можливої виручки.</w:t>
+        <w:br/>
+        <w:br/>
+        <w:t>## Встановлення та запуск</w:t>
+        <w:br/>
+        <w:t>python -m venv .venv</w:t>
+        <w:br/>
+        <w:t>.venv\Scripts\activate</w:t>
+        <w:br/>
+        <w:t>python -m pip install -e .</w:t>
+        <w:br/>
+        <w:t>python -m hotel_booking.main</w:t>
+      </w:r>
     </w:p>
     <w:p>
       <w:pPr>
-        <w:spacing w:before="240" w:after="80"/>
+        <w:spacing w:before="200" w:after="80" w:line="276" w:lineRule="auto"/>
+        <w:jc w:val="both"/>
       </w:pPr>
       <w:r>
         <w:rPr>
+          <w:rFonts w:ascii="Times New Roman" w:hAnsi="Times New Roman"/>
           <w:b/>
-          <w:sz w:val="26"/>
         </w:rPr>
         <w:t>8. Створення virtual environment та запуск</w:t>
       </w:r>
     </w:p>
-    <w:tbl>
-      <w:tblPr>
-        <w:tblW w:type="auto" w:w="0"/>
-        <w:jc w:val="center"/>
-        <w:tblLook w:firstColumn="1" w:firstRow="1" w:lastColumn="0" w:lastRow="0" w:noHBand="0" w:noVBand="1" w:val="04A0"/>
-      </w:tblPr>
-      <w:tblGrid>
-        <w:gridCol w:w="9936"/>
-      </w:tblGrid>
-      <w:tr>
-        <w:tc>
-          <w:tcPr>
-            <w:tcW w:type="dxa" w:w="9936"/>
-            <w:shd w:fill="F4F5F7"/>
-            <w:tcBorders>
-              <w:top w:val="single" w:sz="4" w:space="0" w:color="D1D5DB"/>
-              <w:left w:val="single" w:sz="4" w:space="0" w:color="D1D5DB"/>
-              <w:bottom w:val="single" w:sz="4" w:space="0" w:color="D1D5DB"/>
-              <w:right w:val="single" w:sz="4" w:space="0" w:color="D1D5DB"/>
-            </w:tcBorders>
-          </w:tcPr>
-          <w:p>
-            <w:pPr>
-              <w:spacing w:before="40" w:after="40" w:line="240" w:lineRule="auto"/>
-            </w:pPr>
-            <w:r>
-              <w:rPr>
-                <w:rFonts w:ascii="Consolas" w:hAnsi="Consolas"/>
-                <w:sz w:val="19"/>
-              </w:rPr>
-              <w:t>python -m venv .venv</w:t>
-              <w:br/>
-              <w:t xml:space="preserve">    .venv\Scripts\activate</w:t>
-              <w:br/>
-              <w:t xml:space="preserve">    python -m pip install -e .</w:t>
-              <w:br/>
-              <w:t xml:space="preserve">    python -m hotel_booking.main</w:t>
-            </w:r>
-          </w:p>
-        </w:tc>
-      </w:tr>
-    </w:tbl>
     <w:p>
       <w:pPr>
-        <w:spacing w:after="40"/>
+        <w:spacing w:before="40" w:after="80" w:line="240" w:lineRule="auto"/>
       </w:pPr>
+      <w:r>
+        <w:rPr>
+          <w:rFonts w:ascii="Courier New" w:hAnsi="Courier New"/>
+          <w:sz w:val="20"/>
+        </w:rPr>
+        <w:t>python -m venv .venv</w:t>
+        <w:br/>
+        <w:t>.venv\Scripts\activate</w:t>
+        <w:br/>
+        <w:t>python -m pip install -e .</w:t>
+        <w:br/>
+        <w:t>python -m hotel_booking.main</w:t>
+      </w:r>
     </w:p>
     <w:p>
       <w:pPr>
-        <w:spacing w:before="240" w:after="80"/>
+        <w:spacing w:before="200" w:after="80" w:line="276" w:lineRule="auto"/>
+        <w:jc w:val="both"/>
       </w:pPr>
       <w:r>
         <w:rPr>
+          <w:rFonts w:ascii="Times New Roman" w:hAnsi="Times New Roman"/>
           <w:b/>
-          <w:sz w:val="26"/>
         </w:rPr>
         <w:t>9. Результат роботи програми</w:t>
       </w:r>
     </w:p>
     <w:p>
       <w:pPr>
-        <w:spacing w:after="80" w:line="276" w:lineRule="auto"/>
+        <w:spacing w:before="0" w:after="80" w:line="276" w:lineRule="auto"/>
         <w:jc w:val="both"/>
       </w:pPr>
       <w:r>
-        <w:t>Робота системи бронювання готелю: список вільних номерів, бронювання, пошук найдешевшого номера, обчислення виручки:</w:t>
+        <w:rPr>
+          <w:rFonts w:ascii="Times New Roman" w:hAnsi="Times New Roman"/>
+          <w:b w:val="0"/>
+        </w:rPr>
+        <w:t>Фактичний результат запуску програми «Система бронювання готелю»:</w:t>
       </w:r>
-    </w:p>
-    <w:tbl>
-      <w:tblPr>
-        <w:tblW w:type="auto" w:w="0"/>
-        <w:jc w:val="center"/>
-        <w:tblLook w:firstColumn="1" w:firstRow="1" w:lastColumn="0" w:lastRow="0" w:noHBand="0" w:noVBand="1" w:val="04A0"/>
-      </w:tblPr>
-      <w:tblGrid>
-        <w:gridCol w:w="9936"/>
-      </w:tblGrid>
-      <w:tr>
-        <w:tc>
-          <w:tcPr>
-            <w:tcW w:type="dxa" w:w="9936"/>
-            <w:shd w:fill="F4F5F7"/>
-            <w:tcBorders>
-              <w:top w:val="single" w:sz="4" w:space="0" w:color="D1D5DB"/>
-              <w:left w:val="single" w:sz="4" w:space="0" w:color="D1D5DB"/>
-              <w:bottom w:val="single" w:sz="4" w:space="0" w:color="D1D5DB"/>
-              <w:right w:val="single" w:sz="4" w:space="0" w:color="D1D5DB"/>
-            </w:tcBorders>
-          </w:tcPr>
-          <w:p>
-            <w:pPr>
-              <w:spacing w:before="40" w:after="40" w:line="240" w:lineRule="auto"/>
-            </w:pPr>
-            <w:r>
-              <w:rPr>
-                <w:rFonts w:ascii="Consolas" w:hAnsi="Consolas"/>
-                <w:sz w:val="19"/>
-              </w:rPr>
-              <w:t>--- Hotel Booking Menu ---</w:t>
-              <w:br/>
-              <w:t xml:space="preserve">    1. Show all rooms</w:t>
-              <w:br/>
-              <w:t xml:space="preserve">    2. Show available rooms</w:t>
-              <w:br/>
-              <w:t xml:space="preserve">    3. Book a room</w:t>
-              <w:br/>
-              <w:t xml:space="preserve">    4. Cancel booking</w:t>
-              <w:br/>
-              <w:t xml:space="preserve">    5. Find cheapest available room</w:t>
-              <w:br/>
-              <w:t xml:space="preserve">    6. Show current revenue</w:t>
-              <w:br/>
-              <w:t xml:space="preserve">    7. Exit</w:t>
-              <w:br/>
-              <w:t xml:space="preserve">    Select command (1-7): 1</w:t>
-              <w:br/>
-              <w:t xml:space="preserve">    </w:t>
-              <w:br/>
-              <w:t xml:space="preserve">    All Hotel Rooms:</w:t>
-              <w:br/>
-              <w:t xml:space="preserve">      Room #101  | Type: Standard   | Price: $60.00   | Status: Available</w:t>
-              <w:br/>
-              <w:t xml:space="preserve">      Room #102  | Type: Standard   | Price: $75.00   | Status: Booked</w:t>
-              <w:br/>
-              <w:t xml:space="preserve">      Room #201  | Type: Deluxe     | Price: $120.00  | Status: Available</w:t>
-              <w:br/>
-              <w:t xml:space="preserve">      Room #202  | Type: Deluxe     | Price: $110.00  | Status: Available</w:t>
-              <w:br/>
-              <w:t xml:space="preserve">      Room #301  | Type: Suite      | Price: $250.00  | Status: Booked</w:t>
-              <w:br/>
-              <w:t xml:space="preserve">    </w:t>
-              <w:br/>
-              <w:t xml:space="preserve">    Select command (1-7): 2</w:t>
-              <w:br/>
-              <w:t xml:space="preserve">    </w:t>
-              <w:br/>
-              <w:t xml:space="preserve">    Available Rooms:</w:t>
-              <w:br/>
-              <w:t xml:space="preserve">      Room #101  | Type: Standard   | Price: $60.00   | Status: Available</w:t>
-              <w:br/>
-              <w:t xml:space="preserve">      Room #201  | Type: Deluxe     | Price: $120.00  | Status: Available</w:t>
-              <w:br/>
-              <w:t xml:space="preserve">      Room #202  | Type: Deluxe     | Price: $110.00  | Status: Available</w:t>
-              <w:br/>
-              <w:t xml:space="preserve">    </w:t>
-              <w:br/>
-              <w:t xml:space="preserve">    Select command (1-7): 3</w:t>
-              <w:br/>
-              <w:t xml:space="preserve">    Enter room number to book: 101</w:t>
-              <w:br/>
-              <w:t xml:space="preserve">    Room #101 successfully booked!</w:t>
-              <w:br/>
-              <w:t xml:space="preserve">    </w:t>
-              <w:br/>
-              <w:t xml:space="preserve">    Select command (1-7): 5</w:t>
-              <w:br/>
-              <w:t xml:space="preserve">    Cheapest room: #202 (Deluxe) - $110.00</w:t>
-              <w:br/>
-              <w:t xml:space="preserve">    </w:t>
-              <w:br/>
-              <w:t xml:space="preserve">    Select command (1-7): 6</w:t>
-              <w:br/>
-              <w:t xml:space="preserve">    Current revenue from bookings: $385.00</w:t>
-              <w:br/>
-              <w:t xml:space="preserve">    </w:t>
-              <w:br/>
-              <w:t xml:space="preserve">    Select command (1-7): 7</w:t>
-              <w:br/>
-              <w:t xml:space="preserve">    Goodbye!</w:t>
-            </w:r>
-          </w:p>
-        </w:tc>
-      </w:tr>
-    </w:tbl>
-    <w:p>
-      <w:pPr>
-        <w:spacing w:after="40"/>
-      </w:pPr>
     </w:p>
     <w:p>
       <w:pPr>
-        <w:spacing w:before="240" w:after="80"/>
+        <w:spacing w:before="40" w:after="80" w:line="240" w:lineRule="auto"/>
       </w:pPr>
       <w:r>
         <w:rPr>
+          <w:rFonts w:ascii="Courier New" w:hAnsi="Courier New"/>
+          <w:sz w:val="20"/>
+        </w:rPr>
+        <w:t>Всі номери:</w:t>
+        <w:br/>
+        <w:t xml:space="preserve">  Номер: 101, Тип: Standard, Ціна: 60.0, Статус: Available</w:t>
+        <w:br/>
+        <w:t xml:space="preserve">  Номер: 102, Тип: Standard, Ціна: 75.0, Статус: Booked</w:t>
+        <w:br/>
+        <w:t xml:space="preserve">  Номер: 201, Тип: Deluxe, Ціна: 120.0, Статус: Available</w:t>
+        <w:br/>
+        <w:t xml:space="preserve">  Номер: 202, Тип: Deluxe, Ціна: 110.0, Статус: Available</w:t>
+        <w:br/>
+        <w:t xml:space="preserve">  Номер: 301, Тип: Suite, Ціна: 250.0, Статус: Booked</w:t>
+        <w:br/>
+        <w:br/>
+        <w:t>Список вільних номерів:</w:t>
+        <w:br/>
+        <w:t xml:space="preserve">  Номер: 101, Тип: Standard, Ціна: 60.0, Статус: Available</w:t>
+        <w:br/>
+        <w:t xml:space="preserve">  Номер: 201, Тип: Deluxe, Ціна: 120.0, Статус: Available</w:t>
+        <w:br/>
+        <w:t xml:space="preserve">  Номер: 202, Тип: Deluxe, Ціна: 110.0, Статус: Available</w:t>
+        <w:br/>
+        <w:br/>
+        <w:t>Бронювання:</w:t>
+        <w:br/>
+        <w:t>Номер 101 успішно заброньовано.</w:t>
+        <w:br/>
+        <w:br/>
+        <w:t>Пошук найдешевшого номера:</w:t>
+        <w:br/>
+        <w:t>Номер: 202, Тип: Deluxe, Ціна: 110.0, Статус: Available</w:t>
+        <w:br/>
+        <w:br/>
+        <w:t>Обчислення можливої виручки:</w:t>
+        <w:br/>
+        <w:t>Загальна сума виручки заброньованих номерів: 385.00</w:t>
+        <w:br/>
+        <w:br/>
+        <w:t>Скасування бронювання:</w:t>
+        <w:br/>
+        <w:t>Скасування бронювання для номера 101 виконано успішно.</w:t>
+      </w:r>
+    </w:p>
+    <w:p>
+      <w:pPr>
+        <w:spacing w:before="200" w:after="80" w:line="276" w:lineRule="auto"/>
+        <w:jc w:val="both"/>
+      </w:pPr>
+      <w:r>
+        <w:rPr>
+          <w:rFonts w:ascii="Times New Roman" w:hAnsi="Times New Roman"/>
           <w:b/>
-          <w:sz w:val="26"/>
         </w:rPr>
         <w:t>10. Робота з Git</w:t>
       </w:r>
     </w:p>
-    <w:tbl>
-      <w:tblPr>
-        <w:tblW w:type="auto" w:w="0"/>
-        <w:jc w:val="center"/>
-        <w:tblLook w:firstColumn="1" w:firstRow="1" w:lastColumn="0" w:lastRow="0" w:noHBand="0" w:noVBand="1" w:val="04A0"/>
-      </w:tblPr>
-      <w:tblGrid>
-        <w:gridCol w:w="9936"/>
-      </w:tblGrid>
-      <w:tr>
-        <w:tc>
-          <w:tcPr>
-            <w:tcW w:type="dxa" w:w="9936"/>
-            <w:shd w:fill="F4F5F7"/>
-            <w:tcBorders>
-              <w:top w:val="single" w:sz="4" w:space="0" w:color="D1D5DB"/>
-              <w:left w:val="single" w:sz="4" w:space="0" w:color="D1D5DB"/>
-              <w:bottom w:val="single" w:sz="4" w:space="0" w:color="D1D5DB"/>
-              <w:right w:val="single" w:sz="4" w:space="0" w:color="D1D5DB"/>
-            </w:tcBorders>
-          </w:tcPr>
-          <w:p>
-            <w:pPr>
-              <w:spacing w:before="40" w:after="40" w:line="240" w:lineRule="auto"/>
-            </w:pPr>
-            <w:r>
-              <w:rPr>
-                <w:rFonts w:ascii="Consolas" w:hAnsi="Consolas"/>
-                <w:sz w:val="19"/>
-              </w:rPr>
-              <w:t>git init</w:t>
-              <w:br/>
-              <w:t xml:space="preserve">    git add .gitignore pyproject.toml src/hotel_booking/__init__.py</w:t>
-              <w:br/>
-              <w:t xml:space="preserve">    git commit -m "Create project structure and configuration"</w:t>
-              <w:br/>
-              <w:t xml:space="preserve">    git add src/hotel_booking/models.py src/hotel_booking/services.py</w:t>
-              <w:br/>
-              <w:t xml:space="preserve">    git commit -m "Add room data model and booking business logic"</w:t>
-              <w:br/>
-              <w:t xml:space="preserve">    git add src/hotel_booking/main.py README.md</w:t>
-              <w:br/>
-              <w:t xml:space="preserve">    git commit -m "Add application entry point and documentation"</w:t>
-              <w:br/>
-              <w:t xml:space="preserve">    git branch -M main</w:t>
-              <w:br/>
-              <w:t xml:space="preserve">    git remote add origin https://github.com/Miar0/pro-python-lab-1.git</w:t>
-              <w:br/>
-              <w:t xml:space="preserve">    git push -u origin main</w:t>
-            </w:r>
-          </w:p>
-        </w:tc>
-      </w:tr>
-    </w:tbl>
     <w:p>
       <w:pPr>
-        <w:spacing w:after="40"/>
+        <w:spacing w:before="40" w:after="80" w:line="240" w:lineRule="auto"/>
       </w:pPr>
+      <w:r>
+        <w:rPr>
+          <w:rFonts w:ascii="Courier New" w:hAnsi="Courier New"/>
+          <w:sz w:val="20"/>
+        </w:rPr>
+        <w:t>git init</w:t>
+        <w:br/>
+        <w:t>git add .gitignore pyproject.toml src/hotel_booking/__init__.py</w:t>
+        <w:br/>
+        <w:t>git commit -m "Create project structure and configuration"</w:t>
+        <w:br/>
+        <w:t>git add src/hotel_booking/models.py src/hotel_booking/services.py</w:t>
+        <w:br/>
+        <w:t>git commit -m "Add room data model and booking business logic"</w:t>
+        <w:br/>
+        <w:t>git add src/hotel_booking/main.py README.md</w:t>
+        <w:br/>
+        <w:t>git commit -m "Add application entry point and documentation"</w:t>
+        <w:br/>
+        <w:t>git branch -M main</w:t>
+        <w:br/>
+        <w:t>git remote add origin https://github.com/Miar0/pro-python-lab-1.git</w:t>
+        <w:br/>
+        <w:t>git push -u origin main</w:t>
+      </w:r>
     </w:p>
     <w:p>
       <w:pPr>
-        <w:spacing w:before="160" w:after="40"/>
+        <w:spacing w:before="120" w:after="80" w:line="276" w:lineRule="auto"/>
+        <w:jc w:val="both"/>
       </w:pPr>
       <w:r>
         <w:rPr>
+          <w:rFonts w:ascii="Times New Roman" w:hAnsi="Times New Roman"/>
           <w:b/>
-          <w:sz w:val="24"/>
         </w:rPr>
         <w:t>10.1. Результат git status</w:t>
       </w:r>
     </w:p>
-    <w:tbl>
-      <w:tblPr>
-        <w:tblW w:type="auto" w:w="0"/>
-        <w:jc w:val="center"/>
-        <w:tblLook w:firstColumn="1" w:firstRow="1" w:lastColumn="0" w:lastRow="0" w:noHBand="0" w:noVBand="1" w:val="04A0"/>
-      </w:tblPr>
-      <w:tblGrid>
-        <w:gridCol w:w="9936"/>
-      </w:tblGrid>
-      <w:tr>
-        <w:tc>
-          <w:tcPr>
-            <w:tcW w:type="dxa" w:w="9936"/>
-            <w:shd w:fill="F4F5F7"/>
-            <w:tcBorders>
-              <w:top w:val="single" w:sz="4" w:space="0" w:color="D1D5DB"/>
-              <w:left w:val="single" w:sz="4" w:space="0" w:color="D1D5DB"/>
-              <w:bottom w:val="single" w:sz="4" w:space="0" w:color="D1D5DB"/>
-              <w:right w:val="single" w:sz="4" w:space="0" w:color="D1D5DB"/>
-            </w:tcBorders>
-          </w:tcPr>
-          <w:p>
-            <w:pPr>
-              <w:spacing w:before="40" w:after="40" w:line="240" w:lineRule="auto"/>
-            </w:pPr>
-            <w:r>
-              <w:rPr>
-                <w:rFonts w:ascii="Consolas" w:hAnsi="Consolas"/>
-                <w:sz w:val="19"/>
-              </w:rPr>
-              <w:t>On branch master</w:t>
-              <w:br/>
-              <w:t xml:space="preserve">    nothing to commit, working tree clean</w:t>
-            </w:r>
-          </w:p>
-        </w:tc>
-      </w:tr>
-    </w:tbl>
     <w:p>
       <w:pPr>
-        <w:spacing w:after="40"/>
+        <w:spacing w:before="40" w:after="80" w:line="240" w:lineRule="auto"/>
       </w:pPr>
+      <w:r>
+        <w:rPr>
+          <w:rFonts w:ascii="Courier New" w:hAnsi="Courier New"/>
+          <w:sz w:val="20"/>
+        </w:rPr>
+        <w:t>On branch master</w:t>
+        <w:br/>
+        <w:t>nothing to commit, working tree clean</w:t>
+      </w:r>
     </w:p>
     <w:p>
       <w:pPr>
-        <w:spacing w:before="160" w:after="40"/>
+        <w:spacing w:before="120" w:after="80" w:line="276" w:lineRule="auto"/>
+        <w:jc w:val="both"/>
       </w:pPr>
       <w:r>
         <w:rPr>
+          <w:rFonts w:ascii="Times New Roman" w:hAnsi="Times New Roman"/>
           <w:b/>
-          <w:sz w:val="24"/>
         </w:rPr>
         <w:t>10.2. Результат git log --oneline</w:t>
       </w:r>
     </w:p>
-    <w:tbl>
-      <w:tblPr>
-        <w:tblW w:type="auto" w:w="0"/>
-        <w:jc w:val="center"/>
-        <w:tblLook w:firstColumn="1" w:firstRow="1" w:lastColumn="0" w:lastRow="0" w:noHBand="0" w:noVBand="1" w:val="04A0"/>
-      </w:tblPr>
-      <w:tblGrid>
-        <w:gridCol w:w="9936"/>
-      </w:tblGrid>
-      <w:tr>
-        <w:tc>
-          <w:tcPr>
-            <w:tcW w:type="dxa" w:w="9936"/>
-            <w:shd w:fill="F4F5F7"/>
-            <w:tcBorders>
-              <w:top w:val="single" w:sz="4" w:space="0" w:color="D1D5DB"/>
-              <w:left w:val="single" w:sz="4" w:space="0" w:color="D1D5DB"/>
-              <w:bottom w:val="single" w:sz="4" w:space="0" w:color="D1D5DB"/>
-              <w:right w:val="single" w:sz="4" w:space="0" w:color="D1D5DB"/>
-            </w:tcBorders>
-          </w:tcPr>
-          <w:p>
-            <w:pPr>
-              <w:spacing w:before="40" w:after="40" w:line="240" w:lineRule="auto"/>
-            </w:pPr>
-            <w:r>
-              <w:rPr>
-                <w:rFonts w:ascii="Consolas" w:hAnsi="Consolas"/>
-                <w:sz w:val="19"/>
-              </w:rPr>
-              <w:t>680effc Add application entry point and documentation</w:t>
-              <w:br/>
-              <w:t xml:space="preserve">    ebac680 Add room data model and booking business logic</w:t>
-              <w:br/>
-              <w:t xml:space="preserve">    5777d43 Create project structure and configuration</w:t>
-            </w:r>
-          </w:p>
-        </w:tc>
-      </w:tr>
-    </w:tbl>
     <w:p>
       <w:pPr>
-        <w:spacing w:after="40"/>
+        <w:spacing w:before="40" w:after="80" w:line="240" w:lineRule="auto"/>
       </w:pPr>
+      <w:r>
+        <w:rPr>
+          <w:rFonts w:ascii="Courier New" w:hAnsi="Courier New"/>
+          <w:sz w:val="20"/>
+        </w:rPr>
+        <w:t>680effc Add application entry point and documentation</w:t>
+        <w:br/>
+        <w:t>ebac680 Add room data model and booking business logic</w:t>
+        <w:br/>
+        <w:t>5777d43 Create project structure and configuration</w:t>
+      </w:r>
     </w:p>
     <w:p>
       <w:pPr>
-        <w:spacing w:before="240" w:after="80"/>
+        <w:spacing w:before="200" w:after="80" w:line="276" w:lineRule="auto"/>
+        <w:jc w:val="both"/>
       </w:pPr>
       <w:r>
         <w:rPr>
+          <w:rFonts w:ascii="Times New Roman" w:hAnsi="Times New Roman"/>
           <w:b/>
-          <w:sz w:val="26"/>
         </w:rPr>
         <w:t>11. Відповіді на контрольні запитання</w:t>
       </w:r>
     </w:p>
     <w:p>
       <w:pPr>
-        <w:spacing w:before="80" w:after="20"/>
+        <w:spacing w:before="80" w:after="20" w:line="276" w:lineRule="auto"/>
+        <w:jc w:val="both"/>
       </w:pPr>
       <w:r>
         <w:rPr>
+          <w:rFonts w:ascii="Times New Roman" w:hAnsi="Times New Roman"/>
           <w:b/>
         </w:rPr>
         <w:t>1. Що таке Python-проєкт?</w:t>
@@ -1253,18 +903,25 @@
     </w:p>
     <w:p>
       <w:pPr>
-        <w:spacing w:after="80" w:line="276" w:lineRule="auto"/>
+        <w:spacing w:before="0" w:after="80" w:line="276" w:lineRule="auto"/>
+        <w:jc w:val="both"/>
       </w:pPr>
       <w:r>
+        <w:rPr>
+          <w:rFonts w:ascii="Times New Roman" w:hAnsi="Times New Roman"/>
+          <w:b w:val="0"/>
+        </w:rPr>
         <w:t>Організована сукупність вихідного коду, модулів, метаданих конфігурації, документації та ресурсів програмного продукту.</w:t>
       </w:r>
     </w:p>
     <w:p>
       <w:pPr>
-        <w:spacing w:before="80" w:after="20"/>
+        <w:spacing w:before="80" w:after="20" w:line="276" w:lineRule="auto"/>
+        <w:jc w:val="both"/>
       </w:pPr>
       <w:r>
         <w:rPr>
+          <w:rFonts w:ascii="Times New Roman" w:hAnsi="Times New Roman"/>
           <w:b/>
         </w:rPr>
         <w:t>2. Чим проєкт відрізняється від одного Python script?</w:t>
@@ -1272,18 +929,25 @@
     </w:p>
     <w:p>
       <w:pPr>
-        <w:spacing w:after="80" w:line="276" w:lineRule="auto"/>
+        <w:spacing w:before="0" w:after="80" w:line="276" w:lineRule="auto"/>
+        <w:jc w:val="both"/>
       </w:pPr>
       <w:r>
-        <w:t>Проєкт структурований на логічні пакети та модулі, має ізольовані залежності, точки конфігурації та призначений для масштабування.</w:t>
+        <w:rPr>
+          <w:rFonts w:ascii="Times New Roman" w:hAnsi="Times New Roman"/>
+          <w:b w:val="0"/>
+        </w:rPr>
+        <w:t>Проєкт має модульну структуру, конфігурацію, документацію, тести та керування залежностями.</w:t>
       </w:r>
     </w:p>
     <w:p>
       <w:pPr>
-        <w:spacing w:before="80" w:after="20"/>
+        <w:spacing w:before="80" w:after="20" w:line="276" w:lineRule="auto"/>
+        <w:jc w:val="both"/>
       </w:pPr>
       <w:r>
         <w:rPr>
+          <w:rFonts w:ascii="Times New Roman" w:hAnsi="Times New Roman"/>
           <w:b/>
         </w:rPr>
         <w:t>3. Що таке Python module?</w:t>
@@ -1291,18 +955,25 @@
     </w:p>
     <w:p>
       <w:pPr>
-        <w:spacing w:after="80" w:line="276" w:lineRule="auto"/>
+        <w:spacing w:before="0" w:after="80" w:line="276" w:lineRule="auto"/>
+        <w:jc w:val="both"/>
       </w:pPr>
       <w:r>
-        <w:t>Будь-який файл із розширенням .py, що містить виконуваний код, функції або класи.</w:t>
+        <w:rPr>
+          <w:rFonts w:ascii="Times New Roman" w:hAnsi="Times New Roman"/>
+          <w:b w:val="0"/>
+        </w:rPr>
+        <w:t>Окремий файл .py, який містить Python-код.</w:t>
       </w:r>
     </w:p>
     <w:p>
       <w:pPr>
-        <w:spacing w:before="80" w:after="20"/>
+        <w:spacing w:before="80" w:after="20" w:line="276" w:lineRule="auto"/>
+        <w:jc w:val="both"/>
       </w:pPr>
       <w:r>
         <w:rPr>
+          <w:rFonts w:ascii="Times New Roman" w:hAnsi="Times New Roman"/>
           <w:b/>
         </w:rPr>
         <w:t>4. Що таке Python package?</w:t>
@@ -1310,18 +981,25 @@
     </w:p>
     <w:p>
       <w:pPr>
-        <w:spacing w:after="80" w:line="276" w:lineRule="auto"/>
+        <w:spacing w:before="0" w:after="80" w:line="276" w:lineRule="auto"/>
+        <w:jc w:val="both"/>
       </w:pPr>
       <w:r>
-        <w:t>Каталог із модулями Python, що дозволяє організовувати простір імен.</w:t>
+        <w:rPr>
+          <w:rFonts w:ascii="Times New Roman" w:hAnsi="Times New Roman"/>
+          <w:b w:val="0"/>
+        </w:rPr>
+        <w:t>Каталог, що об’єднує пов’язані Python modules.</w:t>
       </w:r>
     </w:p>
     <w:p>
       <w:pPr>
-        <w:spacing w:before="80" w:after="20"/>
+        <w:spacing w:before="80" w:after="20" w:line="276" w:lineRule="auto"/>
+        <w:jc w:val="both"/>
       </w:pPr>
       <w:r>
         <w:rPr>
+          <w:rFonts w:ascii="Times New Roman" w:hAnsi="Times New Roman"/>
           <w:b/>
         </w:rPr>
         <w:t>5. Для чого потрібний __init__.py?</w:t>
@@ -1329,18 +1007,25 @@
     </w:p>
     <w:p>
       <w:pPr>
-        <w:spacing w:after="80" w:line="276" w:lineRule="auto"/>
+        <w:spacing w:before="0" w:after="80" w:line="276" w:lineRule="auto"/>
+        <w:jc w:val="both"/>
       </w:pPr>
       <w:r>
-        <w:t>Позначає каталог як Python package та ініціалізує пакет при його імпорті.</w:t>
+        <w:rPr>
+          <w:rFonts w:ascii="Times New Roman" w:hAnsi="Times New Roman"/>
+          <w:b w:val="0"/>
+        </w:rPr>
+        <w:t>Для ініціалізації пакета та визначення його простору імен.</w:t>
       </w:r>
     </w:p>
     <w:p>
       <w:pPr>
-        <w:spacing w:before="80" w:after="20"/>
+        <w:spacing w:before="80" w:after="20" w:line="276" w:lineRule="auto"/>
+        <w:jc w:val="both"/>
       </w:pPr>
       <w:r>
         <w:rPr>
+          <w:rFonts w:ascii="Times New Roman" w:hAnsi="Times New Roman"/>
           <w:b/>
         </w:rPr>
         <w:t>6. Що таке src-layout?</w:t>
@@ -1348,18 +1033,25 @@
     </w:p>
     <w:p>
       <w:pPr>
-        <w:spacing w:after="80" w:line="276" w:lineRule="auto"/>
+        <w:spacing w:before="0" w:after="80" w:line="276" w:lineRule="auto"/>
+        <w:jc w:val="both"/>
       </w:pPr>
       <w:r>
-        <w:t>Підхід до структурування проєкту, за якого сирцевий код розміщується в окремій теці src.</w:t>
+        <w:rPr>
+          <w:rFonts w:ascii="Times New Roman" w:hAnsi="Times New Roman"/>
+          <w:b w:val="0"/>
+        </w:rPr>
+        <w:t>Підхід до структурування проєкту, за якого сирцевий код розміщується в окремому каталозі src.</w:t>
       </w:r>
     </w:p>
     <w:p>
       <w:pPr>
-        <w:spacing w:before="80" w:after="20"/>
+        <w:spacing w:before="80" w:after="20" w:line="276" w:lineRule="auto"/>
+        <w:jc w:val="both"/>
       </w:pPr>
       <w:r>
         <w:rPr>
+          <w:rFonts w:ascii="Times New Roman" w:hAnsi="Times New Roman"/>
           <w:b/>
         </w:rPr>
         <w:t>7. Які переваги має src-layout?</w:t>
@@ -1367,18 +1059,25 @@
     </w:p>
     <w:p>
       <w:pPr>
-        <w:spacing w:after="80" w:line="276" w:lineRule="auto"/>
+        <w:spacing w:before="0" w:after="80" w:line="276" w:lineRule="auto"/>
+        <w:jc w:val="both"/>
       </w:pPr>
       <w:r>
-        <w:t>Унеможливлює випадковий імпорт коду з поточної робочої теки замість встановленого пакета (запобігає import parity bugs).</w:t>
+        <w:rPr>
+          <w:rFonts w:ascii="Times New Roman" w:hAnsi="Times New Roman"/>
+          <w:b w:val="0"/>
+        </w:rPr>
+        <w:t>Запобігає випадковому імпорту локального коду замість встановленого пакета.</w:t>
       </w:r>
     </w:p>
     <w:p>
       <w:pPr>
-        <w:spacing w:before="80" w:after="20"/>
+        <w:spacing w:before="80" w:after="20" w:line="276" w:lineRule="auto"/>
+        <w:jc w:val="both"/>
       </w:pPr>
       <w:r>
         <w:rPr>
+          <w:rFonts w:ascii="Times New Roman" w:hAnsi="Times New Roman"/>
           <w:b/>
         </w:rPr>
         <w:t>8. Для чого використовується virtual environment?</w:t>
@@ -1386,18 +1085,25 @@
     </w:p>
     <w:p>
       <w:pPr>
-        <w:spacing w:after="80" w:line="276" w:lineRule="auto"/>
+        <w:spacing w:before="0" w:after="80" w:line="276" w:lineRule="auto"/>
+        <w:jc w:val="both"/>
       </w:pPr>
       <w:r>
-        <w:t>Для ізоляції сторонніх бібліотек та залежностей проєкту від системного інтерпретатора.</w:t>
+        <w:rPr>
+          <w:rFonts w:ascii="Times New Roman" w:hAnsi="Times New Roman"/>
+          <w:b w:val="0"/>
+        </w:rPr>
+        <w:t>Для ізоляції залежностей та пакетів конкретного проєкту.</w:t>
       </w:r>
     </w:p>
     <w:p>
       <w:pPr>
-        <w:spacing w:before="80" w:after="20"/>
+        <w:spacing w:before="80" w:after="20" w:line="276" w:lineRule="auto"/>
+        <w:jc w:val="both"/>
       </w:pPr>
       <w:r>
         <w:rPr>
+          <w:rFonts w:ascii="Times New Roman" w:hAnsi="Times New Roman"/>
           <w:b/>
         </w:rPr>
         <w:t>9. Як створити .venv?</w:t>
@@ -1405,18 +1111,25 @@
     </w:p>
     <w:p>
       <w:pPr>
-        <w:spacing w:after="80" w:line="276" w:lineRule="auto"/>
+        <w:spacing w:before="0" w:after="80" w:line="276" w:lineRule="auto"/>
+        <w:jc w:val="both"/>
       </w:pPr>
       <w:r>
-        <w:t>Командою: python -m venv .venv</w:t>
+        <w:rPr>
+          <w:rFonts w:ascii="Times New Roman" w:hAnsi="Times New Roman"/>
+          <w:b w:val="0"/>
+        </w:rPr>
+        <w:t>python -m venv .venv</w:t>
       </w:r>
     </w:p>
     <w:p>
       <w:pPr>
-        <w:spacing w:before="80" w:after="20"/>
+        <w:spacing w:before="80" w:after="20" w:line="276" w:lineRule="auto"/>
+        <w:jc w:val="both"/>
       </w:pPr>
       <w:r>
         <w:rPr>
+          <w:rFonts w:ascii="Times New Roman" w:hAnsi="Times New Roman"/>
           <w:b/>
         </w:rPr>
         <w:t>10. Як активувати virtual environment?</w:t>
@@ -1424,18 +1137,25 @@
     </w:p>
     <w:p>
       <w:pPr>
-        <w:spacing w:after="80" w:line="276" w:lineRule="auto"/>
+        <w:spacing w:before="0" w:after="80" w:line="276" w:lineRule="auto"/>
+        <w:jc w:val="both"/>
       </w:pPr>
       <w:r>
+        <w:rPr>
+          <w:rFonts w:ascii="Times New Roman" w:hAnsi="Times New Roman"/>
+          <w:b w:val="0"/>
+        </w:rPr>
         <w:t>Windows: .venv\Scripts\activate; Linux/macOS: source .venv/bin/activate.</w:t>
       </w:r>
     </w:p>
     <w:p>
       <w:pPr>
-        <w:spacing w:before="80" w:after="20"/>
+        <w:spacing w:before="80" w:after="20" w:line="276" w:lineRule="auto"/>
+        <w:jc w:val="both"/>
       </w:pPr>
       <w:r>
         <w:rPr>
+          <w:rFonts w:ascii="Times New Roman" w:hAnsi="Times New Roman"/>
           <w:b/>
         </w:rPr>
         <w:t>11. Для чого використовується pip?</w:t>
@@ -1443,18 +1163,25 @@
     </w:p>
     <w:p>
       <w:pPr>
-        <w:spacing w:after="80" w:line="276" w:lineRule="auto"/>
+        <w:spacing w:before="0" w:after="80" w:line="276" w:lineRule="auto"/>
+        <w:jc w:val="both"/>
       </w:pPr>
       <w:r>
-        <w:t>Пакетний менеджер для встановлення та керування бібліотеками Python з індексу PyPI.</w:t>
+        <w:rPr>
+          <w:rFonts w:ascii="Times New Roman" w:hAnsi="Times New Roman"/>
+          <w:b w:val="0"/>
+        </w:rPr>
+        <w:t>Для керування та встановлення сторонніх бібліотек Python.</w:t>
       </w:r>
     </w:p>
     <w:p>
       <w:pPr>
-        <w:spacing w:before="80" w:after="20"/>
+        <w:spacing w:before="80" w:after="20" w:line="276" w:lineRule="auto"/>
+        <w:jc w:val="both"/>
       </w:pPr>
       <w:r>
         <w:rPr>
+          <w:rFonts w:ascii="Times New Roman" w:hAnsi="Times New Roman"/>
           <w:b/>
         </w:rPr>
         <w:t>12. Чому рекомендується python -m pip?</w:t>
@@ -1462,18 +1189,25 @@
     </w:p>
     <w:p>
       <w:pPr>
-        <w:spacing w:after="80" w:line="276" w:lineRule="auto"/>
+        <w:spacing w:before="0" w:after="80" w:line="276" w:lineRule="auto"/>
+        <w:jc w:val="both"/>
       </w:pPr>
       <w:r>
-        <w:t>Гарантує використання pip саме того інтерпретатора Python, який зараз викликано.</w:t>
+        <w:rPr>
+          <w:rFonts w:ascii="Times New Roman" w:hAnsi="Times New Roman"/>
+          <w:b w:val="0"/>
+        </w:rPr>
+        <w:t>Гарантує використання pip саме поточного активного інтерпретатора.</w:t>
       </w:r>
     </w:p>
     <w:p>
       <w:pPr>
-        <w:spacing w:before="80" w:after="20"/>
+        <w:spacing w:before="80" w:after="20" w:line="276" w:lineRule="auto"/>
+        <w:jc w:val="both"/>
       </w:pPr>
       <w:r>
         <w:rPr>
+          <w:rFonts w:ascii="Times New Roman" w:hAnsi="Times New Roman"/>
           <w:b/>
         </w:rPr>
         <w:t>13. Для чого потрібний pyproject.toml?</w:t>
@@ -1481,18 +1215,25 @@
     </w:p>
     <w:p>
       <w:pPr>
-        <w:spacing w:after="80" w:line="276" w:lineRule="auto"/>
+        <w:spacing w:before="0" w:after="80" w:line="276" w:lineRule="auto"/>
+        <w:jc w:val="both"/>
       </w:pPr>
       <w:r>
-        <w:t>Єдиний стандартний декларативний конфігураційний файл проєкту (PEP 518/621).</w:t>
+        <w:rPr>
+          <w:rFonts w:ascii="Times New Roman" w:hAnsi="Times New Roman"/>
+          <w:b w:val="0"/>
+        </w:rPr>
+        <w:t>Стандартний файл для опису метаданих проєкту, збірки та налаштувань інструментів.</w:t>
       </w:r>
     </w:p>
     <w:p>
       <w:pPr>
-        <w:spacing w:before="80" w:after="20"/>
+        <w:spacing w:before="80" w:after="20" w:line="276" w:lineRule="auto"/>
+        <w:jc w:val="both"/>
       </w:pPr>
       <w:r>
         <w:rPr>
+          <w:rFonts w:ascii="Times New Roman" w:hAnsi="Times New Roman"/>
           <w:b/>
         </w:rPr>
         <w:t>14. Що містить секція [project]?</w:t>
@@ -1500,18 +1241,25 @@
     </w:p>
     <w:p>
       <w:pPr>
-        <w:spacing w:after="80" w:line="276" w:lineRule="auto"/>
+        <w:spacing w:before="0" w:after="80" w:line="276" w:lineRule="auto"/>
+        <w:jc w:val="both"/>
       </w:pPr>
       <w:r>
-        <w:t>Метадані проєкту: ім'я, версію, залежності, опис, сумісні версії Python та скрипти запуску.</w:t>
+        <w:rPr>
+          <w:rFonts w:ascii="Times New Roman" w:hAnsi="Times New Roman"/>
+          <w:b w:val="0"/>
+        </w:rPr>
+        <w:t>Назву, версію, опис, мінімальну версію Python, залежності та точки запуску скриптів.</w:t>
       </w:r>
     </w:p>
     <w:p>
       <w:pPr>
-        <w:spacing w:before="80" w:after="20"/>
+        <w:spacing w:before="80" w:after="20" w:line="276" w:lineRule="auto"/>
+        <w:jc w:val="both"/>
       </w:pPr>
       <w:r>
         <w:rPr>
+          <w:rFonts w:ascii="Times New Roman" w:hAnsi="Times New Roman"/>
           <w:b/>
         </w:rPr>
         <w:t>15. Що таке editable installation?</w:t>
@@ -1519,18 +1267,25 @@
     </w:p>
     <w:p>
       <w:pPr>
-        <w:spacing w:after="80" w:line="276" w:lineRule="auto"/>
+        <w:spacing w:before="0" w:after="80" w:line="276" w:lineRule="auto"/>
+        <w:jc w:val="both"/>
       </w:pPr>
       <w:r>
-        <w:t>Режим встановлення пакета (pip install -e .), коли зміни у файлах коду одразу відображаються у встановленому середовищі.</w:t>
+        <w:rPr>
+          <w:rFonts w:ascii="Times New Roman" w:hAnsi="Times New Roman"/>
+          <w:b w:val="0"/>
+        </w:rPr>
+        <w:t>Встановлення пакета через pip install -e ., при якому зміни коду одразу застосовуються без перевстановлення.</w:t>
       </w:r>
     </w:p>
     <w:p>
       <w:pPr>
-        <w:spacing w:before="80" w:after="20"/>
+        <w:spacing w:before="80" w:after="20" w:line="276" w:lineRule="auto"/>
+        <w:jc w:val="both"/>
       </w:pPr>
       <w:r>
         <w:rPr>
+          <w:rFonts w:ascii="Times New Roman" w:hAnsi="Times New Roman"/>
           <w:b/>
         </w:rPr>
         <w:t>16. Для чого використовується if __name__ == '__main__':?</w:t>
@@ -1538,18 +1293,25 @@
     </w:p>
     <w:p>
       <w:pPr>
-        <w:spacing w:after="80" w:line="276" w:lineRule="auto"/>
+        <w:spacing w:before="0" w:after="80" w:line="276" w:lineRule="auto"/>
+        <w:jc w:val="both"/>
       </w:pPr>
       <w:r>
-        <w:t>Запобігає виконанню коду запуску при імпортуванні модуля іншими скриптами.</w:t>
+        <w:rPr>
+          <w:rFonts w:ascii="Times New Roman" w:hAnsi="Times New Roman"/>
+          <w:b w:val="0"/>
+        </w:rPr>
+        <w:t>Щоб код запуску виконувався лише при прямому старті файлу, а не при його імпорті.</w:t>
       </w:r>
     </w:p>
     <w:p>
       <w:pPr>
-        <w:spacing w:before="80" w:after="20"/>
+        <w:spacing w:before="80" w:after="20" w:line="276" w:lineRule="auto"/>
+        <w:jc w:val="both"/>
       </w:pPr>
       <w:r>
         <w:rPr>
+          <w:rFonts w:ascii="Times New Roman" w:hAnsi="Times New Roman"/>
           <w:b/>
         </w:rPr>
         <w:t>17. Що таке Git?</w:t>
@@ -1557,18 +1319,25 @@
     </w:p>
     <w:p>
       <w:pPr>
-        <w:spacing w:after="80" w:line="276" w:lineRule="auto"/>
+        <w:spacing w:before="0" w:after="80" w:line="276" w:lineRule="auto"/>
+        <w:jc w:val="both"/>
       </w:pPr>
       <w:r>
-        <w:t>Розподілена система контролю версій для відстеження історії змін у файлах.</w:t>
+        <w:rPr>
+          <w:rFonts w:ascii="Times New Roman" w:hAnsi="Times New Roman"/>
+          <w:b w:val="0"/>
+        </w:rPr>
+        <w:t>Розподілена система контролю версій.</w:t>
       </w:r>
     </w:p>
     <w:p>
       <w:pPr>
-        <w:spacing w:before="80" w:after="20"/>
+        <w:spacing w:before="80" w:after="20" w:line="276" w:lineRule="auto"/>
+        <w:jc w:val="both"/>
       </w:pPr>
       <w:r>
         <w:rPr>
+          <w:rFonts w:ascii="Times New Roman" w:hAnsi="Times New Roman"/>
           <w:b/>
         </w:rPr>
         <w:t>18. Що таке repository?</w:t>
@@ -1576,18 +1345,25 @@
     </w:p>
     <w:p>
       <w:pPr>
-        <w:spacing w:after="80" w:line="276" w:lineRule="auto"/>
+        <w:spacing w:before="0" w:after="80" w:line="276" w:lineRule="auto"/>
+        <w:jc w:val="both"/>
       </w:pPr>
       <w:r>
-        <w:t>Сховище файлів проєкту разом із базою даних усієї історії їхніх змін.</w:t>
+        <w:rPr>
+          <w:rFonts w:ascii="Times New Roman" w:hAnsi="Times New Roman"/>
+          <w:b w:val="0"/>
+        </w:rPr>
+        <w:t>Каталог з файлами проєкту та повною історією їх змін під керуванням Git.</w:t>
       </w:r>
     </w:p>
     <w:p>
       <w:pPr>
-        <w:spacing w:before="80" w:after="20"/>
+        <w:spacing w:before="80" w:after="20" w:line="276" w:lineRule="auto"/>
+        <w:jc w:val="both"/>
       </w:pPr>
       <w:r>
         <w:rPr>
+          <w:rFonts w:ascii="Times New Roman" w:hAnsi="Times New Roman"/>
           <w:b/>
         </w:rPr>
         <w:t>19. Що таке commit?</w:t>
@@ -1595,18 +1371,25 @@
     </w:p>
     <w:p>
       <w:pPr>
-        <w:spacing w:after="80" w:line="276" w:lineRule="auto"/>
+        <w:spacing w:before="0" w:after="80" w:line="276" w:lineRule="auto"/>
+        <w:jc w:val="both"/>
       </w:pPr>
       <w:r>
-        <w:t>Збережений знімок (snapshot) проіндексованих змін у репозиторії з унікальним SHA-хешем.</w:t>
+        <w:rPr>
+          <w:rFonts w:ascii="Times New Roman" w:hAnsi="Times New Roman"/>
+          <w:b w:val="0"/>
+        </w:rPr>
+        <w:t>Зафіксований стан файлів репозиторію з унікальним хешем.</w:t>
       </w:r>
     </w:p>
     <w:p>
       <w:pPr>
-        <w:spacing w:before="80" w:after="20"/>
+        <w:spacing w:before="80" w:after="20" w:line="276" w:lineRule="auto"/>
+        <w:jc w:val="both"/>
       </w:pPr>
       <w:r>
         <w:rPr>
+          <w:rFonts w:ascii="Times New Roman" w:hAnsi="Times New Roman"/>
           <w:b/>
         </w:rPr>
         <w:t>20. Для чого використовується git status?</w:t>
@@ -1614,18 +1397,25 @@
     </w:p>
     <w:p>
       <w:pPr>
-        <w:spacing w:after="80" w:line="276" w:lineRule="auto"/>
+        <w:spacing w:before="0" w:after="80" w:line="276" w:lineRule="auto"/>
+        <w:jc w:val="both"/>
       </w:pPr>
       <w:r>
-        <w:t>Показує поточний стан робочого каталогу та індексу (staging area).</w:t>
+        <w:rPr>
+          <w:rFonts w:ascii="Times New Roman" w:hAnsi="Times New Roman"/>
+          <w:b w:val="0"/>
+        </w:rPr>
+        <w:t>Для перегляду стану робочої директорії та індексу Git.</w:t>
       </w:r>
     </w:p>
     <w:p>
       <w:pPr>
-        <w:spacing w:before="80" w:after="20"/>
+        <w:spacing w:before="80" w:after="20" w:line="276" w:lineRule="auto"/>
+        <w:jc w:val="both"/>
       </w:pPr>
       <w:r>
         <w:rPr>
+          <w:rFonts w:ascii="Times New Roman" w:hAnsi="Times New Roman"/>
           <w:b/>
         </w:rPr>
         <w:t>21. Для чого git add?</w:t>
@@ -1633,18 +1423,25 @@
     </w:p>
     <w:p>
       <w:pPr>
-        <w:spacing w:after="80" w:line="276" w:lineRule="auto"/>
+        <w:spacing w:before="0" w:after="80" w:line="276" w:lineRule="auto"/>
+        <w:jc w:val="both"/>
       </w:pPr>
       <w:r>
-        <w:t>Додає зміни у файлах до області підготовки (staging area) перед комітом.</w:t>
+        <w:rPr>
+          <w:rFonts w:ascii="Times New Roman" w:hAnsi="Times New Roman"/>
+          <w:b w:val="0"/>
+        </w:rPr>
+        <w:t>Для додавання змінених файлів до staging area перед створенням коміту.</w:t>
       </w:r>
     </w:p>
     <w:p>
       <w:pPr>
-        <w:spacing w:before="80" w:after="20"/>
+        <w:spacing w:before="80" w:after="20" w:line="276" w:lineRule="auto"/>
+        <w:jc w:val="both"/>
       </w:pPr>
       <w:r>
         <w:rPr>
+          <w:rFonts w:ascii="Times New Roman" w:hAnsi="Times New Roman"/>
           <w:b/>
         </w:rPr>
         <w:t>22. Для чого git commit?</w:t>
@@ -1652,18 +1449,25 @@
     </w:p>
     <w:p>
       <w:pPr>
-        <w:spacing w:after="80" w:line="276" w:lineRule="auto"/>
+        <w:spacing w:before="0" w:after="80" w:line="276" w:lineRule="auto"/>
+        <w:jc w:val="both"/>
       </w:pPr>
       <w:r>
-        <w:t>Фіксує всі підготовлені в індексі зміни в історії репозиторію.</w:t>
+        <w:rPr>
+          <w:rFonts w:ascii="Times New Roman" w:hAnsi="Times New Roman"/>
+          <w:b w:val="0"/>
+        </w:rPr>
+        <w:t>Для збереження проіндексованих змін в історії репозиторію.</w:t>
       </w:r>
     </w:p>
     <w:p>
       <w:pPr>
-        <w:spacing w:before="80" w:after="20"/>
+        <w:spacing w:before="80" w:after="20" w:line="276" w:lineRule="auto"/>
+        <w:jc w:val="both"/>
       </w:pPr>
       <w:r>
         <w:rPr>
+          <w:rFonts w:ascii="Times New Roman" w:hAnsi="Times New Roman"/>
           <w:b/>
         </w:rPr>
         <w:t>23. Що показує git log?</w:t>
@@ -1671,18 +1475,25 @@
     </w:p>
     <w:p>
       <w:pPr>
-        <w:spacing w:after="80" w:line="276" w:lineRule="auto"/>
+        <w:spacing w:before="0" w:after="80" w:line="276" w:lineRule="auto"/>
+        <w:jc w:val="both"/>
       </w:pPr>
       <w:r>
-        <w:t>Хронологічний список збережених комітів репозиторію.</w:t>
+        <w:rPr>
+          <w:rFonts w:ascii="Times New Roman" w:hAnsi="Times New Roman"/>
+          <w:b w:val="0"/>
+        </w:rPr>
+        <w:t>Хронологічну історію збережених комітів.</w:t>
       </w:r>
     </w:p>
     <w:p>
       <w:pPr>
-        <w:spacing w:before="80" w:after="20"/>
+        <w:spacing w:before="80" w:after="20" w:line="276" w:lineRule="auto"/>
+        <w:jc w:val="both"/>
       </w:pPr>
       <w:r>
         <w:rPr>
+          <w:rFonts w:ascii="Times New Roman" w:hAnsi="Times New Roman"/>
           <w:b/>
         </w:rPr>
         <w:t>24. Для чого потрібен .gitignore?</w:t>
@@ -1690,18 +1501,25 @@
     </w:p>
     <w:p>
       <w:pPr>
-        <w:spacing w:after="80" w:line="276" w:lineRule="auto"/>
+        <w:spacing w:before="0" w:after="80" w:line="276" w:lineRule="auto"/>
+        <w:jc w:val="both"/>
       </w:pPr>
       <w:r>
-        <w:t>Вказує шаблони файлів і каталогів, які Git повинен ігнорувати і не додавати до репозиторію.</w:t>
+        <w:rPr>
+          <w:rFonts w:ascii="Times New Roman" w:hAnsi="Times New Roman"/>
+          <w:b w:val="0"/>
+        </w:rPr>
+        <w:t>Вказує файли і папки, які Git повинен ігнорувати.</w:t>
       </w:r>
     </w:p>
     <w:p>
       <w:pPr>
-        <w:spacing w:before="80" w:after="20"/>
+        <w:spacing w:before="80" w:after="20" w:line="276" w:lineRule="auto"/>
+        <w:jc w:val="both"/>
       </w:pPr>
       <w:r>
         <w:rPr>
+          <w:rFonts w:ascii="Times New Roman" w:hAnsi="Times New Roman"/>
           <w:b/>
         </w:rPr>
         <w:t>25. Чому .venv не потрібно комітити?</w:t>
@@ -1709,18 +1527,25 @@
     </w:p>
     <w:p>
       <w:pPr>
-        <w:spacing w:after="80" w:line="276" w:lineRule="auto"/>
+        <w:spacing w:before="0" w:after="80" w:line="276" w:lineRule="auto"/>
+        <w:jc w:val="both"/>
       </w:pPr>
       <w:r>
-        <w:t>Віртуальне оточення займає багато місця, залежить від конкретної ОС і легко відновлюється командою встановлення залежностей.</w:t>
+        <w:rPr>
+          <w:rFonts w:ascii="Times New Roman" w:hAnsi="Times New Roman"/>
+          <w:b w:val="0"/>
+        </w:rPr>
+        <w:t>Віртуальне оточення платформозалежне, об'ємне та легко відновлюється командою встановлення.</w:t>
       </w:r>
     </w:p>
     <w:p>
       <w:pPr>
-        <w:spacing w:before="80" w:after="20"/>
+        <w:spacing w:before="80" w:after="20" w:line="276" w:lineRule="auto"/>
+        <w:jc w:val="both"/>
       </w:pPr>
       <w:r>
         <w:rPr>
+          <w:rFonts w:ascii="Times New Roman" w:hAnsi="Times New Roman"/>
           <w:b/>
         </w:rPr>
         <w:t>26. Для чого потрібний README?</w:t>
@@ -1728,18 +1553,25 @@
     </w:p>
     <w:p>
       <w:pPr>
-        <w:spacing w:after="80" w:line="276" w:lineRule="auto"/>
+        <w:spacing w:before="0" w:after="80" w:line="276" w:lineRule="auto"/>
+        <w:jc w:val="both"/>
       </w:pPr>
       <w:r>
-        <w:t>Слугує первинною документацією, пояснює призначення програми, вимоги та інструкцію із запуску.</w:t>
+        <w:rPr>
+          <w:rFonts w:ascii="Times New Roman" w:hAnsi="Times New Roman"/>
+          <w:b w:val="0"/>
+        </w:rPr>
+        <w:t>Служить початковою документацією із призначенням, встановленням та запуском проєкту.</w:t>
       </w:r>
     </w:p>
     <w:p>
       <w:pPr>
-        <w:spacing w:before="80" w:after="20"/>
+        <w:spacing w:before="80" w:after="20" w:line="276" w:lineRule="auto"/>
+        <w:jc w:val="both"/>
       </w:pPr>
       <w:r>
         <w:rPr>
+          <w:rFonts w:ascii="Times New Roman" w:hAnsi="Times New Roman"/>
           <w:b/>
         </w:rPr>
         <w:t>27. Що таке type hints?</w:t>
@@ -1747,18 +1579,25 @@
     </w:p>
     <w:p>
       <w:pPr>
-        <w:spacing w:after="80" w:line="276" w:lineRule="auto"/>
+        <w:spacing w:before="0" w:after="80" w:line="276" w:lineRule="auto"/>
+        <w:jc w:val="both"/>
       </w:pPr>
       <w:r>
-        <w:t>Анотації типів аргументів та повертаних значень у коді для полегшення читання та статичного аналізу.</w:t>
+        <w:rPr>
+          <w:rFonts w:ascii="Times New Roman" w:hAnsi="Times New Roman"/>
+          <w:b w:val="0"/>
+        </w:rPr>
+        <w:t>Анотації типів у коді для покращення читабельності та статичного аналізу.</w:t>
       </w:r>
     </w:p>
     <w:p>
       <w:pPr>
-        <w:spacing w:before="80" w:after="20"/>
+        <w:spacing w:before="80" w:after="20" w:line="276" w:lineRule="auto"/>
+        <w:jc w:val="both"/>
       </w:pPr>
       <w:r>
         <w:rPr>
+          <w:rFonts w:ascii="Times New Roman" w:hAnsi="Times New Roman"/>
           <w:b/>
         </w:rPr>
         <w:t>28. Для чого програму розділяють на modules?</w:t>
@@ -1766,18 +1605,25 @@
     </w:p>
     <w:p>
       <w:pPr>
-        <w:spacing w:after="80" w:line="276" w:lineRule="auto"/>
+        <w:spacing w:before="0" w:after="80" w:line="276" w:lineRule="auto"/>
+        <w:jc w:val="both"/>
       </w:pPr>
       <w:r>
-        <w:t>Для модульності, спрощення тестування, уникнення дублювання та читабельності коду.</w:t>
+        <w:rPr>
+          <w:rFonts w:ascii="Times New Roman" w:hAnsi="Times New Roman"/>
+          <w:b w:val="0"/>
+        </w:rPr>
+        <w:t>Для забезпечення модульності, зручності супроводу, тестування та читання коду.</w:t>
       </w:r>
     </w:p>
     <w:p>
       <w:pPr>
-        <w:spacing w:before="80" w:after="20"/>
+        <w:spacing w:before="80" w:after="20" w:line="276" w:lineRule="auto"/>
+        <w:jc w:val="both"/>
       </w:pPr>
       <w:r>
         <w:rPr>
+          <w:rFonts w:ascii="Times New Roman" w:hAnsi="Times New Roman"/>
           <w:b/>
         </w:rPr>
         <w:t>29. Що таке business logic?</w:t>
@@ -1785,18 +1631,25 @@
     </w:p>
     <w:p>
       <w:pPr>
-        <w:spacing w:after="80" w:line="276" w:lineRule="auto"/>
+        <w:spacing w:before="0" w:after="80" w:line="276" w:lineRule="auto"/>
+        <w:jc w:val="both"/>
       </w:pPr>
       <w:r>
-        <w:t>Компоненти програми, що безпосередньо реалізують правила предметної області (обчислення, правила бронювання).</w:t>
+        <w:rPr>
+          <w:rFonts w:ascii="Times New Roman" w:hAnsi="Times New Roman"/>
+          <w:b w:val="0"/>
+        </w:rPr>
+        <w:t>Реалізація правил предметної області та алгоритмів обробки даних.</w:t>
       </w:r>
     </w:p>
     <w:p>
       <w:pPr>
-        <w:spacing w:before="80" w:after="20"/>
+        <w:spacing w:before="80" w:after="20" w:line="276" w:lineRule="auto"/>
+        <w:jc w:val="both"/>
       </w:pPr>
       <w:r>
         <w:rPr>
+          <w:rFonts w:ascii="Times New Roman" w:hAnsi="Times New Roman"/>
           <w:b/>
         </w:rPr>
         <w:t>30. Чому потрібно відокремлювати application entry point від business logic?</w:t>
@@ -1804,36 +1657,46 @@
     </w:p>
     <w:p>
       <w:pPr>
-        <w:spacing w:after="80" w:line="276" w:lineRule="auto"/>
+        <w:spacing w:before="0" w:after="80" w:line="276" w:lineRule="auto"/>
+        <w:jc w:val="both"/>
       </w:pPr>
       <w:r>
-        <w:t>Це дозволяє змінювати інтерфейс (CLI, GUI, API) або писати тести без модифікації логіки розрахунків.</w:t>
+        <w:rPr>
+          <w:rFonts w:ascii="Times New Roman" w:hAnsi="Times New Roman"/>
+          <w:b w:val="0"/>
+        </w:rPr>
+        <w:t>Щоб бізнес-логіку можна було повторно використовувати, тестувати та змінювати інтерфейс без переписування правил.</w:t>
       </w:r>
     </w:p>
     <w:p>
       <w:pPr>
-        <w:spacing w:before="240" w:after="80"/>
+        <w:spacing w:before="200" w:after="80" w:line="276" w:lineRule="auto"/>
+        <w:jc w:val="both"/>
       </w:pPr>
       <w:r>
         <w:rPr>
+          <w:rFonts w:ascii="Times New Roman" w:hAnsi="Times New Roman"/>
           <w:b/>
-          <w:sz w:val="26"/>
         </w:rPr>
         <w:t>12. Висновок</w:t>
       </w:r>
     </w:p>
     <w:p>
       <w:pPr>
-        <w:spacing w:after="80" w:line="276" w:lineRule="auto"/>
+        <w:spacing w:before="0" w:after="80" w:line="276" w:lineRule="auto"/>
         <w:jc w:val="both"/>
       </w:pPr>
       <w:r>
-        <w:t>У лабораторній роботі створено структурований Python-проєкт за стандартом src-layout для системи бронювання готелю (варіант №8). Реалізовано data model Room з атрибутами номера, типу, ціни та статусу бронювання, модуль business logic (services.py) для отримання списку вільних номерів, бронювання, скасування бронювання, пошуку найдешевшого номера та обчислення можливої виручки, точку входу main.py з консольним меню, type hints, обробку кастомних винятків (BookingError). Підготовлено pyproject.toml, .gitignore і README.md, а також сформовано історію з трьох логічних Git-комітів та завантажено проєкт на GitHub (репозиторій Miar0/pro-python-lab-1). Отримано практичні навички організації професійного Python-проєкту, роботи з virtual environment і Git.</w:t>
+        <w:rPr>
+          <w:rFonts w:ascii="Times New Roman" w:hAnsi="Times New Roman"/>
+          <w:b w:val="0"/>
+        </w:rPr>
+        <w:t>У лабораторній роботі реалізовано консольний застосунок «Система бронювання готелю» за індивідуальним варіантом №8 з використанням структури src-layout. Створено data model Room (номер, тип, ціна, статус бронювання) та власний виняток BookingError. У модулі services.py реалізовано список вільних номерів, бронювання, скасування бронювання, пошук найдешевшого номера та обчислення можливої виручки. Налаштовано pyproject.toml, .gitignore, README.md та зафіксовано історію з трьох комітів у Git-репозиторії. Отримано практичні навички професійної організації Python-проєктів.</w:t>
       </w:r>
     </w:p>
     <w:sectPr>
       <w:pgSz w:w="12240" w:h="15840"/>
-      <w:pgMar w:top="864" w:right="864" w:bottom="864" w:left="1440" w:header="720" w:footer="720" w:gutter="0"/>
+      <w:pgMar w:top="1152" w:right="1152" w:bottom="1152" w:left="1440" w:header="720" w:footer="720" w:gutter="0"/>
       <w:cols w:space="720"/>
       <w:docGrid w:linePitch="360"/>
     </w:sectPr>

</xml_diff>

<commit_message>
Add tests and synchronize report with official template
</commit_message>
<xml_diff>
--- a/Lab_01/Lab №1 Професійний Python.docx
+++ b/Lab_01/Lab №1 Професійний Python.docx
@@ -136,7 +136,7 @@
           <w:rFonts w:ascii="Times New Roman" w:hAnsi="Times New Roman"/>
           <w:b w:val="0"/>
         </w:rPr>
-        <w:t>Варіант 8. Система бронювання готелю. Для номера: номер, тип, ціна, статус бронювання. Реалізувати: список вільних номерів, бронювання, скасування бронювання, пошук найдешевшого номера, обчислення можливої виручки.</w:t>
+        <w:t>Варіант №8 — «Система бронювання готелю». Для номера зберігати: номер, тип, ціна, статус бронювання. Реалізувати: список вільних номерів, бронювання, скасування бронювання, пошук найдешевшого номера, обчислення можливої виручки.</w:t>
       </w:r>
     </w:p>
     <w:p>
@@ -149,7 +149,7 @@
           <w:rFonts w:ascii="Times New Roman" w:hAnsi="Times New Roman"/>
           <w:b w:val="0"/>
         </w:rPr>
-        <w:t>Програма повинна мати структуру src-layout, містити щонайменше три Python modules, щонайменше одну data model, окремий module з business logic, main.py, використовувати type hints, містити щонайменше три функції, приймати декілька вхідних значень, виконувати обробку даних, формувати зрозумілий результат, використовувати конструкцію if __name__ == '__main__':, мати README.md, мати .gitignore, мати pyproject.toml, бути доданою до Git repository.</w:t>
+        <w:t>Проєкт повинен мати src-layout, щонайменше три Python modules, data model, окремий module з business logic, main.py, type hints, README.md, .gitignore, pyproject.toml і Git repository.</w:t>
       </w:r>
     </w:p>
     <w:p>
@@ -182,17 +182,21 @@
         <w:br/>
         <w:t>├── .gitignore</w:t>
         <w:br/>
-        <w:t>└── src/</w:t>
+        <w:t>├── src/</w:t>
         <w:br/>
-        <w:t xml:space="preserve">    └── hotel_booking/</w:t>
+        <w:t>│   └── hotel_booking/</w:t>
         <w:br/>
-        <w:t xml:space="preserve">        ├── __init__.py</w:t>
+        <w:t>│       ├── __init__.py</w:t>
         <w:br/>
-        <w:t xml:space="preserve">        ├── main.py</w:t>
+        <w:t>│       ├── main.py</w:t>
         <w:br/>
-        <w:t xml:space="preserve">        ├── models.py</w:t>
+        <w:t>│       ├── models.py</w:t>
         <w:br/>
-        <w:t xml:space="preserve">        └── services.py</w:t>
+        <w:t>│       └── services.py</w:t>
+        <w:br/>
+        <w:t>└── tests/</w:t>
+        <w:br/>
+        <w:t xml:space="preserve">    └── test_services.py</w:t>
       </w:r>
     </w:p>
     <w:p>
@@ -205,7 +209,7 @@
           <w:rFonts w:ascii="Times New Roman" w:hAnsi="Times New Roman"/>
           <w:b w:val="0"/>
         </w:rPr>
-        <w:t>Каталог src/hotel_booking містить пакет програми системи бронювання готелю. Файл models.py описує номер, тип, ціна, статус бронювання. Файл services.py реалізує список вільних номерів, бронювання, скасування бронювання, пошук найдешевшого номера, обчислення можливої виручки. Модуль main.py забезпечує запуск застосунку та консольне меню.</w:t>
+        <w:t>Каталог src/hotel_booking містить пакет застосунку. models.py описує модель даних Room, services.py містить business logic, main.py є точкою входу, а tests/test_services.py містить автоматизовані тести.</w:t>
       </w:r>
     </w:p>
     <w:p>
@@ -244,7 +248,7 @@
           <w:rFonts w:ascii="Times New Roman" w:hAnsi="Times New Roman"/>
           <w:b w:val="0"/>
         </w:rPr>
-        <w:t>У модулі models.py реалізовано data model Room для представлення сутності номера готелю з полями: номер (room_number), тип (room_type), ціна (price), статус бронювання (is_booked). Додано клас BookingError для обробки виняткових ситуацій під час бронювання номерів готелю.</w:t>
+        <w:t>Для представлення номера готелю використано dataclass Room з полями number, room_type, price та is_booked. Реалізовано BookingError для валідації та обробки винятків.</w:t>
       </w:r>
     </w:p>
     <w:p>
@@ -256,41 +260,17 @@
           <w:rFonts w:ascii="Courier New" w:hAnsi="Courier New"/>
           <w:sz w:val="20"/>
         </w:rPr>
-        <w:t>from dataclasses import dataclass</w:t>
-        <w:br/>
-        <w:br/>
-        <w:t>class BookingError(Exception):</w:t>
-        <w:br/>
-        <w:t xml:space="preserve">    """Виняток для операцій бронювання."""</w:t>
-        <w:br/>
-        <w:t xml:space="preserve">    pass</w:t>
-        <w:br/>
-        <w:br/>
         <w:t>@dataclass</w:t>
         <w:br/>
         <w:t>class Room:</w:t>
         <w:br/>
-        <w:t xml:space="preserve">    room_number: int</w:t>
+        <w:t xml:space="preserve">    number: int</w:t>
         <w:br/>
         <w:t xml:space="preserve">    room_type: str</w:t>
         <w:br/>
         <w:t xml:space="preserve">    price: float</w:t>
         <w:br/>
         <w:t xml:space="preserve">    is_booked: bool = False</w:t>
-        <w:br/>
-        <w:br/>
-        <w:t xml:space="preserve">    @property</w:t>
-        <w:br/>
-        <w:t xml:space="preserve">    def number(self) -&gt; int:</w:t>
-        <w:br/>
-        <w:t xml:space="preserve">        return self.room_number</w:t>
-        <w:br/>
-        <w:br/>
-        <w:t xml:space="preserve">    @property</w:t>
-        <w:br/>
-        <w:t xml:space="preserve">    def booking_status(self) -&gt; bool:</w:t>
-        <w:br/>
-        <w:t xml:space="preserve">        return self.is_booked</w:t>
         <w:br/>
         <w:br/>
         <w:t xml:space="preserve">    @property</w:t>
@@ -302,7 +282,7 @@
         <w:br/>
         <w:t xml:space="preserve">    def __str__(self) -&gt; str:</w:t>
         <w:br/>
-        <w:t xml:space="preserve">        return f"Номер: {self.room_number}, Тип: {self.room_type}, Ціна: {self.price}, Статус: {self.status}"</w:t>
+        <w:t xml:space="preserve">        return f"Room #{self.number:&lt;4} | Type: {self.room_type:&lt;10} | Price: ${self.price:&lt;7.2f} | Status: {self.status}"</w:t>
       </w:r>
     </w:p>
     <w:p>
@@ -328,7 +308,7 @@
           <w:rFonts w:ascii="Times New Roman" w:hAnsi="Times New Roman"/>
           <w:b w:val="0"/>
         </w:rPr>
-        <w:t>У модулі services.py реалізовано функції бізнес-логіки варіанта 8: список вільних номерів (get_available_rooms), бронювання номера (book_room), скасування бронювання (cancel_booking), пошук найдешевшого номера (find_cheapest_room), обчислення можливої виручки (calculate_potential_revenue), пошук номера за його значенням (find_room_by_number).</w:t>
+        <w:t>У модулі реалізовано функції get_available_rooms(), book_room(), cancel_booking(), find_cheapest_room() та calculate_potential_revenue(). Business logic не залежить від консольного інтерфейсу.</w:t>
       </w:r>
     </w:p>
     <w:p>
@@ -340,53 +320,31 @@
           <w:rFonts w:ascii="Courier New" w:hAnsi="Courier New"/>
           <w:sz w:val="20"/>
         </w:rPr>
-        <w:t>from hotel_booking.models import BookingError, Room</w:t>
-        <w:br/>
-        <w:br/>
         <w:t>def get_available_rooms(rooms: list[Room]) -&gt; list[Room]:</w:t>
-        <w:br/>
-        <w:t xml:space="preserve">    """Список вільних номерів."""</w:t>
         <w:br/>
         <w:t xml:space="preserve">    return [room for room in rooms if not room.is_booked]</w:t>
         <w:br/>
         <w:br/>
-        <w:t>def find_room_by_number(rooms: list[Room], room_number: int) -&gt; Room:</w:t>
+        <w:t>def book_room(rooms: list[Room], number: int) -&gt; Room:</w:t>
         <w:br/>
-        <w:t xml:space="preserve">    """Пошук номера."""</w:t>
-        <w:br/>
-        <w:t xml:space="preserve">    for room in rooms:</w:t>
-        <w:br/>
-        <w:t xml:space="preserve">        if room.room_number == room_number:</w:t>
-        <w:br/>
-        <w:t xml:space="preserve">            return room</w:t>
-        <w:br/>
-        <w:t xml:space="preserve">    raise BookingError(f"Номер {room_number} не знайдено.")</w:t>
-        <w:br/>
-        <w:br/>
-        <w:t>def book_room(rooms: list[Room], room_number: int) -&gt; Room:</w:t>
-        <w:br/>
-        <w:t xml:space="preserve">    """Бронювання."""</w:t>
-        <w:br/>
-        <w:t xml:space="preserve">    room = find_room_by_number(rooms, room_number)</w:t>
+        <w:t xml:space="preserve">    room = find_room_by_number(rooms, number)</w:t>
         <w:br/>
         <w:t xml:space="preserve">    if room.is_booked:</w:t>
         <w:br/>
-        <w:t xml:space="preserve">        raise BookingError(f"Номер {room_number} вже заброньовано.")</w:t>
+        <w:t xml:space="preserve">        raise BookingError(f"Room #{number} is already booked.")</w:t>
         <w:br/>
         <w:t xml:space="preserve">    room.is_booked = True</w:t>
         <w:br/>
         <w:t xml:space="preserve">    return room</w:t>
         <w:br/>
         <w:br/>
-        <w:t>def cancel_booking(rooms: list[Room], room_number: int) -&gt; Room:</w:t>
+        <w:t>def cancel_booking(rooms: list[Room], number: int) -&gt; Room:</w:t>
         <w:br/>
-        <w:t xml:space="preserve">    """Скасування бронювання."""</w:t>
-        <w:br/>
-        <w:t xml:space="preserve">    room = find_room_by_number(rooms, room_number)</w:t>
+        <w:t xml:space="preserve">    room = find_room_by_number(rooms, number)</w:t>
         <w:br/>
         <w:t xml:space="preserve">    if not room.is_booked:</w:t>
         <w:br/>
-        <w:t xml:space="preserve">        raise BookingError(f"Номер {room_number} не заброньовано.")</w:t>
+        <w:t xml:space="preserve">        raise BookingError(f"Room #{number} is not booked.")</w:t>
         <w:br/>
         <w:t xml:space="preserve">    room.is_booked = False</w:t>
         <w:br/>
@@ -395,20 +353,12 @@
         <w:br/>
         <w:t>def find_cheapest_room(rooms: list[Room]) -&gt; Room | None:</w:t>
         <w:br/>
-        <w:t xml:space="preserve">    """Пошук найдешевшого номера."""</w:t>
-        <w:br/>
         <w:t xml:space="preserve">    available = get_available_rooms(rooms)</w:t>
         <w:br/>
-        <w:t xml:space="preserve">    if not available:</w:t>
-        <w:br/>
-        <w:t xml:space="preserve">        return None</w:t>
-        <w:br/>
-        <w:t xml:space="preserve">    return min(available, key=lambda room: room.price)</w:t>
+        <w:t xml:space="preserve">    return min(available, key=lambda r: r.price, default=None)</w:t>
         <w:br/>
         <w:br/>
         <w:t>def calculate_potential_revenue(rooms: list[Room]) -&gt; float:</w:t>
-        <w:br/>
-        <w:t xml:space="preserve">    """Обчислення можливої виручки."""</w:t>
         <w:br/>
         <w:t xml:space="preserve">    return sum(room.price for room in rooms if room.is_booked)</w:t>
       </w:r>
@@ -436,7 +386,7 @@
           <w:rFonts w:ascii="Times New Roman" w:hAnsi="Times New Roman"/>
           <w:b w:val="0"/>
         </w:rPr>
-        <w:t>Модуль main.py є точкою входу програми, створює список номерів готелю, забезпечує консольне меню для виклику операцій: список вільних номерів, бронювання, скасування бронювання, пошук найдешевшого номера, обчислення можливої виручки.</w:t>
+        <w:t>Модуль main.py створює демонстраційні дані, викликає функції business logic та виводить результати. Конструкція if __name__ == '__main__': відокремлює точку входу від функцій програми.</w:t>
       </w:r>
     </w:p>
     <w:p>
@@ -448,73 +398,44 @@
           <w:rFonts w:ascii="Courier New" w:hAnsi="Courier New"/>
           <w:sz w:val="20"/>
         </w:rPr>
-        <w:t>from hotel_booking.models import BookingError, Room</w:t>
-        <w:br/>
-        <w:t>from hotel_booking.services import (</w:t>
-        <w:br/>
-        <w:t xml:space="preserve">    book_room,</w:t>
-        <w:br/>
-        <w:t xml:space="preserve">    cancel_booking,</w:t>
-        <w:br/>
-        <w:t xml:space="preserve">    calculate_potential_revenue,</w:t>
-        <w:br/>
-        <w:t xml:space="preserve">    find_cheapest_room,</w:t>
-        <w:br/>
-        <w:t xml:space="preserve">    get_available_rooms,</w:t>
-        <w:br/>
-        <w:t>)</w:t>
-        <w:br/>
-        <w:br/>
-        <w:t>def create_demo_rooms() -&gt; list[Room]:</w:t>
-        <w:br/>
-        <w:t xml:space="preserve">    return [</w:t>
-        <w:br/>
-        <w:t xml:space="preserve">        Room(room_number=101, room_type="Standard", price=60.0, is_booked=False),</w:t>
-        <w:br/>
-        <w:t xml:space="preserve">        Room(room_number=102, room_type="Standard", price=75.0, is_booked=True),</w:t>
-        <w:br/>
-        <w:t xml:space="preserve">        Room(room_number=201, room_type="Deluxe", price=120.0, is_booked=False),</w:t>
-        <w:br/>
-        <w:t xml:space="preserve">        Room(room_number=202, room_type="Deluxe", price=110.0, is_booked=False),</w:t>
-        <w:br/>
-        <w:t xml:space="preserve">        Room(room_number=301, room_type="Suite", price=250.0, is_booked=True),</w:t>
-        <w:br/>
-        <w:t xml:space="preserve">    ]</w:t>
-        <w:br/>
-        <w:br/>
-        <w:t>def print_rooms(rooms: list[Room], title: str = "Номери готелю") -&gt; None:</w:t>
-        <w:br/>
-        <w:t xml:space="preserve">    print(f"\n{title}:")</w:t>
-        <w:br/>
-        <w:t xml:space="preserve">    for room in rooms:</w:t>
-        <w:br/>
-        <w:t xml:space="preserve">        print(f"  {room}")</w:t>
-        <w:br/>
-        <w:br/>
         <w:t>def main() -&gt; None:</w:t>
         <w:br/>
         <w:t xml:space="preserve">    rooms = create_demo_rooms()</w:t>
         <w:br/>
-        <w:t xml:space="preserve">    print_rooms(rooms, "Всі номери")</w:t>
+        <w:t xml:space="preserve">    print_rooms(rooms, "All Rooms")</w:t>
         <w:br/>
-        <w:t xml:space="preserve">    print_rooms(get_available_rooms(rooms), "Список вільних номерів")</w:t>
-        <w:br/>
-        <w:t xml:space="preserve">    book_room(rooms, 101)</w:t>
-        <w:br/>
-        <w:t xml:space="preserve">    print("Бронювання номера 101 виконано.")</w:t>
-        <w:br/>
-        <w:t xml:space="preserve">    ch = find_cheapest_room(rooms)</w:t>
-        <w:br/>
-        <w:t xml:space="preserve">    print(f"Пошук найдешевшого номера: {ch}")</w:t>
-        <w:br/>
-        <w:t xml:space="preserve">    rev = calculate_potential_revenue(rooms)</w:t>
-        <w:br/>
-        <w:t xml:space="preserve">    print(f"Обчислення можливої виручки: {rev}")</w:t>
+        <w:t xml:space="preserve">    print_rooms(get_available_rooms(rooms), "Available Rooms")</w:t>
         <w:br/>
         <w:br/>
         <w:t>if __name__ == "__main__":</w:t>
         <w:br/>
         <w:t xml:space="preserve">    main()</w:t>
+      </w:r>
+    </w:p>
+    <w:p>
+      <w:pPr>
+        <w:spacing w:before="120" w:after="80" w:line="276" w:lineRule="auto"/>
+        <w:jc w:val="both"/>
+      </w:pPr>
+      <w:r>
+        <w:rPr>
+          <w:rFonts w:ascii="Times New Roman" w:hAnsi="Times New Roman"/>
+          <w:b/>
+        </w:rPr>
+        <w:t>4.4. test_services.py</w:t>
+      </w:r>
+    </w:p>
+    <w:p>
+      <w:pPr>
+        <w:spacing w:before="0" w:after="80" w:line="276" w:lineRule="auto"/>
+        <w:jc w:val="both"/>
+      </w:pPr>
+      <w:r>
+        <w:rPr>
+          <w:rFonts w:ascii="Times New Roman" w:hAnsi="Times New Roman"/>
+          <w:b w:val="0"/>
+        </w:rPr>
+        <w:t>Додано pytest-тести для перевірки списку вільних номерів, бронювання, скасування бронювання, пошуку найдешевшого номера та обчислення можливої виручки.</w:t>
       </w:r>
     </w:p>
     <w:p>
@@ -528,6 +449,19 @@
           <w:b/>
         </w:rPr>
         <w:t>5. Файл pyproject.toml</w:t>
+      </w:r>
+    </w:p>
+    <w:p>
+      <w:pPr>
+        <w:spacing w:before="0" w:after="80" w:line="276" w:lineRule="auto"/>
+        <w:jc w:val="both"/>
+      </w:pPr>
+      <w:r>
+        <w:rPr>
+          <w:rFonts w:ascii="Times New Roman" w:hAnsi="Times New Roman"/>
+          <w:b w:val="0"/>
+        </w:rPr>
+        <w:t>Файл задає build system setuptools, метадані проєкту, Python 3.11+, тестову залежність pytest, console script та параметри pytest.</w:t>
       </w:r>
     </w:p>
     <w:p>
@@ -552,14 +486,26 @@
         <w:br/>
         <w:t>version = "0.1.0"</w:t>
         <w:br/>
-        <w:t>description = "Система бронювання готелю"</w:t>
+        <w:t>description = "Hotel booking system laboratory project"</w:t>
         <w:br/>
         <w:t>requires-python = "&gt;=3.11"</w:t>
+        <w:br/>
+        <w:br/>
+        <w:t>[project.optional-dependencies]</w:t>
+        <w:br/>
+        <w:t>test = ["pytest&gt;=8.0"]</w:t>
         <w:br/>
         <w:br/>
         <w:t>[project.scripts]</w:t>
         <w:br/>
         <w:t>hotel-booking = "hotel_booking.main:main"</w:t>
+        <w:br/>
+        <w:br/>
+        <w:t>[tool.pytest.ini_options]</w:t>
+        <w:br/>
+        <w:t>pythonpath = ["src"]</w:t>
+        <w:br/>
+        <w:t>testpaths = ["tests"]</w:t>
       </w:r>
     </w:p>
     <w:p>
@@ -573,6 +519,19 @@
           <w:b/>
         </w:rPr>
         <w:t>6. Файл .gitignore</w:t>
+      </w:r>
+    </w:p>
+    <w:p>
+      <w:pPr>
+        <w:spacing w:before="0" w:after="80" w:line="276" w:lineRule="auto"/>
+        <w:jc w:val="both"/>
+      </w:pPr>
+      <w:r>
+        <w:rPr>
+          <w:rFonts w:ascii="Times New Roman" w:hAnsi="Times New Roman"/>
+          <w:b w:val="0"/>
+        </w:rPr>
+        <w:t>З Git виключено virtual environment, кеші, IDE configuration, build artifacts і .env.</w:t>
       </w:r>
     </w:p>
     <w:p>
@@ -627,24 +586,28 @@
           <w:rFonts w:ascii="Courier New" w:hAnsi="Courier New"/>
           <w:sz w:val="20"/>
         </w:rPr>
-        <w:t># Система бронювання готелю</w:t>
+        <w:t># Hotel Booking System</w:t>
         <w:br/>
         <w:t>Лабораторна робота №1 з курсу «Професійний Python», варіант №8.</w:t>
         <w:br/>
-        <w:t>Для номера: номер, тип, ціна, статус бронювання.</w:t>
         <w:br/>
-        <w:t>Реалізовано: список вільних номерів, бронювання, скасування бронювання, пошук найдешевшого номера, обчислення можливої виручки.</w:t>
-        <w:br/>
-        <w:br/>
-        <w:t>## Встановлення та запуск</w:t>
+        <w:t>## Installation</w:t>
         <w:br/>
         <w:t>python -m venv .venv</w:t>
         <w:br/>
-        <w:t>.venv\Scripts\activate</w:t>
-        <w:br/>
         <w:t>python -m pip install -e .</w:t>
         <w:br/>
+        <w:br/>
+        <w:t>## Run</w:t>
+        <w:br/>
         <w:t>python -m hotel_booking.main</w:t>
+        <w:br/>
+        <w:br/>
+        <w:t>## Tests</w:t>
+        <w:br/>
+        <w:t>python -m pip install -e ".[test]"</w:t>
+        <w:br/>
+        <w:t>python -m pytest</w:t>
       </w:r>
     </w:p>
     <w:p>
@@ -673,7 +636,7 @@
         <w:br/>
         <w:t>.venv\Scripts\activate</w:t>
         <w:br/>
-        <w:t>python -m pip install -e .</w:t>
+        <w:t>python -m pip install -e ".[test]"</w:t>
         <w:br/>
         <w:t>python -m hotel_booking.main</w:t>
       </w:r>
@@ -701,7 +664,7 @@
           <w:rFonts w:ascii="Times New Roman" w:hAnsi="Times New Roman"/>
           <w:b w:val="0"/>
         </w:rPr>
-        <w:t>Фактичний результат запуску програми «Система бронювання готелю»:</w:t>
+        <w:t>Фактичний результат запуску згенерованого проєкту:</w:t>
       </w:r>
     </w:p>
     <w:p>
@@ -713,46 +676,54 @@
           <w:rFonts w:ascii="Courier New" w:hAnsi="Courier New"/>
           <w:sz w:val="20"/>
         </w:rPr>
-        <w:t>Всі номери:</w:t>
+        <w:t>ALL ROOMS</w:t>
         <w:br/>
-        <w:t xml:space="preserve">  Номер: 101, Тип: Standard, Ціна: 60.0, Статус: Available</w:t>
+        <w:t>Room #  Type       Price     Status</w:t>
         <w:br/>
-        <w:t xml:space="preserve">  Номер: 102, Тип: Standard, Ціна: 75.0, Статус: Booked</w:t>
+        <w:t>---------------------------------------</w:t>
         <w:br/>
-        <w:t xml:space="preserve">  Номер: 201, Тип: Deluxe, Ціна: 120.0, Статус: Available</w:t>
+        <w:t>101     Standard   $60.00    Available</w:t>
         <w:br/>
-        <w:t xml:space="preserve">  Номер: 202, Тип: Deluxe, Ціна: 110.0, Статус: Available</w:t>
+        <w:t>102     Standard   $75.00    Booked</w:t>
         <w:br/>
-        <w:t xml:space="preserve">  Номер: 301, Тип: Suite, Ціна: 250.0, Статус: Booked</w:t>
+        <w:t>201     Deluxe     $120.00   Available</w:t>
+        <w:br/>
+        <w:t>202     Deluxe     $110.00   Available</w:t>
+        <w:br/>
+        <w:t>301     Suite      $250.00   Booked</w:t>
         <w:br/>
         <w:br/>
-        <w:t>Список вільних номерів:</w:t>
+        <w:t>AVAILABLE ROOMS</w:t>
         <w:br/>
-        <w:t xml:space="preserve">  Номер: 101, Тип: Standard, Ціна: 60.0, Статус: Available</w:t>
+        <w:t>Room #  Type       Price     Status</w:t>
         <w:br/>
-        <w:t xml:space="preserve">  Номер: 201, Тип: Deluxe, Ціна: 120.0, Статус: Available</w:t>
+        <w:t>---------------------------------------</w:t>
         <w:br/>
-        <w:t xml:space="preserve">  Номер: 202, Тип: Deluxe, Ціна: 110.0, Статус: Available</w:t>
+        <w:t>101     Standard   $60.00    Available</w:t>
+        <w:br/>
+        <w:t>201     Deluxe     $120.00   Available</w:t>
+        <w:br/>
+        <w:t>202     Deluxe     $110.00   Available</w:t>
         <w:br/>
         <w:br/>
-        <w:t>Бронювання:</w:t>
+        <w:t>BOOKING</w:t>
         <w:br/>
-        <w:t>Номер 101 успішно заброньовано.</w:t>
+        <w:t>Room #101 successfully booked.</w:t>
         <w:br/>
         <w:br/>
-        <w:t>Пошук найдешевшого номера:</w:t>
+        <w:t>CHEAPEST AVAILABLE ROOM</w:t>
         <w:br/>
-        <w:t>Номер: 202, Тип: Deluxe, Ціна: 110.0, Статус: Available</w:t>
+        <w:t>Room #202 (Deluxe) - $110.00</w:t>
         <w:br/>
         <w:br/>
-        <w:t>Обчислення можливої виручки:</w:t>
+        <w:t>POTENTIAL REVENUE</w:t>
         <w:br/>
-        <w:t>Загальна сума виручки заброньованих номерів: 385.00</w:t>
+        <w:t>Total revenue from booked rooms: $385.00</w:t>
         <w:br/>
         <w:br/>
-        <w:t>Скасування бронювання:</w:t>
+        <w:t>CANCEL BOOKING</w:t>
         <w:br/>
-        <w:t>Скасування бронювання для номера 101 виконано успішно.</w:t>
+        <w:t>Booking for room #101 successfully cancelled.</w:t>
       </w:r>
     </w:p>
     <w:p>
@@ -770,6 +741,19 @@
     </w:p>
     <w:p>
       <w:pPr>
+        <w:spacing w:before="0" w:after="80" w:line="276" w:lineRule="auto"/>
+        <w:jc w:val="both"/>
+      </w:pPr>
+      <w:r>
+        <w:rPr>
+          <w:rFonts w:ascii="Times New Roman" w:hAnsi="Times New Roman"/>
+          <w:b w:val="0"/>
+        </w:rPr>
+        <w:t>У проєкті створено три логічні commits.</w:t>
+      </w:r>
+    </w:p>
+    <w:p>
+      <w:pPr>
         <w:spacing w:before="40" w:after="80" w:line="240" w:lineRule="auto"/>
       </w:pPr>
       <w:r>
@@ -781,21 +765,15 @@
         <w:br/>
         <w:t>git add .gitignore pyproject.toml src/hotel_booking/__init__.py</w:t>
         <w:br/>
-        <w:t>git commit -m "Create project structure and configuration"</w:t>
+        <w:t>git commit -m "Create project structure"</w:t>
         <w:br/>
-        <w:t>git add src/hotel_booking/models.py src/hotel_booking/services.py</w:t>
+        <w:t>git add src/hotel_booking/models.py src/hotel_booking/services.py tests/test_services.py</w:t>
         <w:br/>
-        <w:t>git commit -m "Add room data model and booking business logic"</w:t>
+        <w:t>git commit -m "Add room model and booking business logic"</w:t>
         <w:br/>
         <w:t>git add src/hotel_booking/main.py README.md</w:t>
         <w:br/>
-        <w:t>git commit -m "Add application entry point and documentation"</w:t>
-        <w:br/>
-        <w:t>git branch -M main</w:t>
-        <w:br/>
-        <w:t>git remote add origin https://github.com/Miar0/pro-python-lab-1.git</w:t>
-        <w:br/>
-        <w:t>git push -u origin main</w:t>
+        <w:t xml:space="preserve">git commit -m "Add application entry point and documentation" </w:t>
       </w:r>
     </w:p>
     <w:p>
@@ -849,9 +827,9 @@
         </w:rPr>
         <w:t>680effc Add application entry point and documentation</w:t>
         <w:br/>
-        <w:t>ebac680 Add room data model and booking business logic</w:t>
+        <w:t>ebac680 Add room model and booking business logic</w:t>
         <w:br/>
-        <w:t>5777d43 Create project structure and configuration</w:t>
+        <w:t>5777d43 Create project structure</w:t>
       </w:r>
     </w:p>
     <w:p>
@@ -890,7 +868,7 @@
           <w:rFonts w:ascii="Times New Roman" w:hAnsi="Times New Roman"/>
           <w:b w:val="0"/>
         </w:rPr>
-        <w:t>Організована сукупність вихідного коду, модулів, метаданих конфігурації, документації та ресурсів програмного продукту.</w:t>
+        <w:t>Організована сукупність коду, конфігурації, документації, тестів та ресурсів програмного продукту.</w:t>
       </w:r>
     </w:p>
     <w:p>
@@ -994,7 +972,7 @@
           <w:rFonts w:ascii="Times New Roman" w:hAnsi="Times New Roman"/>
           <w:b w:val="0"/>
         </w:rPr>
-        <w:t>Для ініціалізації пакета та визначення його простору імен.</w:t>
+        <w:t>Для ініціалізації пакета та, за потреби, визначення його метаданих або API.</w:t>
       </w:r>
     </w:p>
     <w:p>
@@ -1020,7 +998,7 @@
           <w:rFonts w:ascii="Times New Roman" w:hAnsi="Times New Roman"/>
           <w:b w:val="0"/>
         </w:rPr>
-        <w:t>Підхід до структурування проєкту, за якого сирцевий код розміщується в окремому каталозі src.</w:t>
+        <w:t>Структура, у якій вихідний код розміщується в окремому каталозі src.</w:t>
       </w:r>
     </w:p>
     <w:p>
@@ -1046,7 +1024,7 @@
           <w:rFonts w:ascii="Times New Roman" w:hAnsi="Times New Roman"/>
           <w:b w:val="0"/>
         </w:rPr>
-        <w:t>Запобігає випадковому імпорту локального коду замість встановленого пакета.</w:t>
+        <w:t>Чіткіша структура та коректніша перевірка встановленого пакета.</w:t>
       </w:r>
     </w:p>
     <w:p>
@@ -1072,7 +1050,7 @@
           <w:rFonts w:ascii="Times New Roman" w:hAnsi="Times New Roman"/>
           <w:b w:val="0"/>
         </w:rPr>
-        <w:t>Для ізоляції залежностей та пакетів конкретного проєкту.</w:t>
+        <w:t>Для ізоляції залежностей проєкту.</w:t>
       </w:r>
     </w:p>
     <w:p>
@@ -1150,7 +1128,7 @@
           <w:rFonts w:ascii="Times New Roman" w:hAnsi="Times New Roman"/>
           <w:b w:val="0"/>
         </w:rPr>
-        <w:t>Для керування та встановлення сторонніх бібліотек Python.</w:t>
+        <w:t>Для керування Python packages.</w:t>
       </w:r>
     </w:p>
     <w:p>
@@ -1176,7 +1154,7 @@
           <w:rFonts w:ascii="Times New Roman" w:hAnsi="Times New Roman"/>
           <w:b w:val="0"/>
         </w:rPr>
-        <w:t>Гарантує використання pip саме поточного активного інтерпретатора.</w:t>
+        <w:t>Щоб використовувати pip саме поточного Python interpreter.</w:t>
       </w:r>
     </w:p>
     <w:p>
@@ -1202,7 +1180,7 @@
           <w:rFonts w:ascii="Times New Roman" w:hAnsi="Times New Roman"/>
           <w:b w:val="0"/>
         </w:rPr>
-        <w:t>Стандартний файл для опису метаданих проєкту, збірки та налаштувань інструментів.</w:t>
+        <w:t>Для метаданих, build system, залежностей і конфігурації інструментів.</w:t>
       </w:r>
     </w:p>
     <w:p>
@@ -1228,7 +1206,7 @@
           <w:rFonts w:ascii="Times New Roman" w:hAnsi="Times New Roman"/>
           <w:b w:val="0"/>
         </w:rPr>
-        <w:t>Назву, версію, опис, мінімальну версію Python, залежності та точки запуску скриптів.</w:t>
+        <w:t>Назву, версію, опис, вимоги до Python, залежності та інші метадані.</w:t>
       </w:r>
     </w:p>
     <w:p>
@@ -1254,7 +1232,7 @@
           <w:rFonts w:ascii="Times New Roman" w:hAnsi="Times New Roman"/>
           <w:b w:val="0"/>
         </w:rPr>
-        <w:t>Встановлення пакета через pip install -e ., при якому зміни коду одразу застосовуються без перевстановлення.</w:t>
+        <w:t>Встановлення з -e, коли зміни source code одразу доступні пакету.</w:t>
       </w:r>
     </w:p>
     <w:p>
@@ -1280,7 +1258,7 @@
           <w:rFonts w:ascii="Times New Roman" w:hAnsi="Times New Roman"/>
           <w:b w:val="0"/>
         </w:rPr>
-        <w:t>Щоб код запуску виконувався лише при прямому старті файлу, а не при його імпорті.</w:t>
+        <w:t>Щоб точка входу виконувалася лише при безпосередньому запуску.</w:t>
       </w:r>
     </w:p>
     <w:p>
@@ -1332,7 +1310,7 @@
           <w:rFonts w:ascii="Times New Roman" w:hAnsi="Times New Roman"/>
           <w:b w:val="0"/>
         </w:rPr>
-        <w:t>Каталог з файлами проєкту та повною історією їх змін під керуванням Git.</w:t>
+        <w:t>Сховище файлів проєкту разом з Git-історією.</w:t>
       </w:r>
     </w:p>
     <w:p>
@@ -1358,7 +1336,7 @@
           <w:rFonts w:ascii="Times New Roman" w:hAnsi="Times New Roman"/>
           <w:b w:val="0"/>
         </w:rPr>
-        <w:t>Зафіксований стан файлів репозиторію з унікальним хешем.</w:t>
+        <w:t>Зафіксований набір змін з унікальним ідентифікатором.</w:t>
       </w:r>
     </w:p>
     <w:p>
@@ -1384,7 +1362,7 @@
           <w:rFonts w:ascii="Times New Roman" w:hAnsi="Times New Roman"/>
           <w:b w:val="0"/>
         </w:rPr>
-        <w:t>Для перегляду стану робочої директорії та індексу Git.</w:t>
+        <w:t>Для перегляду стану working tree і staging area.</w:t>
       </w:r>
     </w:p>
     <w:p>
@@ -1410,7 +1388,7 @@
           <w:rFonts w:ascii="Times New Roman" w:hAnsi="Times New Roman"/>
           <w:b w:val="0"/>
         </w:rPr>
-        <w:t>Для додавання змінених файлів до staging area перед створенням коміту.</w:t>
+        <w:t>Для додавання змін до staging area.</w:t>
       </w:r>
     </w:p>
     <w:p>
@@ -1436,7 +1414,7 @@
           <w:rFonts w:ascii="Times New Roman" w:hAnsi="Times New Roman"/>
           <w:b w:val="0"/>
         </w:rPr>
-        <w:t>Для збереження проіндексованих змін в історії репозиторію.</w:t>
+        <w:t>Для фіксації підготовлених змін.</w:t>
       </w:r>
     </w:p>
     <w:p>
@@ -1462,7 +1440,7 @@
           <w:rFonts w:ascii="Times New Roman" w:hAnsi="Times New Roman"/>
           <w:b w:val="0"/>
         </w:rPr>
-        <w:t>Хронологічну історію збережених комітів.</w:t>
+        <w:t>Історію commits.</w:t>
       </w:r>
     </w:p>
     <w:p>
@@ -1488,7 +1466,7 @@
           <w:rFonts w:ascii="Times New Roman" w:hAnsi="Times New Roman"/>
           <w:b w:val="0"/>
         </w:rPr>
-        <w:t>Вказує файли і папки, які Git повинен ігнорувати.</w:t>
+        <w:t>Щоб Git не відстежував зайві або секретні файли.</w:t>
       </w:r>
     </w:p>
     <w:p>
@@ -1514,7 +1492,7 @@
           <w:rFonts w:ascii="Times New Roman" w:hAnsi="Times New Roman"/>
           <w:b w:val="0"/>
         </w:rPr>
-        <w:t>Віртуальне оточення платформозалежне, об'ємне та легко відновлюється командою встановлення.</w:t>
+        <w:t>Воно велике, платформозалежне та легко відтворюється.</w:t>
       </w:r>
     </w:p>
     <w:p>
@@ -1540,7 +1518,7 @@
           <w:rFonts w:ascii="Times New Roman" w:hAnsi="Times New Roman"/>
           <w:b w:val="0"/>
         </w:rPr>
-        <w:t>Служить початковою документацією із призначенням, встановленням та запуском проєкту.</w:t>
+        <w:t>Для опису призначення, встановлення та запуску проєкту.</w:t>
       </w:r>
     </w:p>
     <w:p>
@@ -1566,7 +1544,7 @@
           <w:rFonts w:ascii="Times New Roman" w:hAnsi="Times New Roman"/>
           <w:b w:val="0"/>
         </w:rPr>
-        <w:t>Анотації типів у коді для покращення читабельності та статичного аналізу.</w:t>
+        <w:t>Анотації очікуваних типів даних.</w:t>
       </w:r>
     </w:p>
     <w:p>
@@ -1592,7 +1570,7 @@
           <w:rFonts w:ascii="Times New Roman" w:hAnsi="Times New Roman"/>
           <w:b w:val="0"/>
         </w:rPr>
-        <w:t>Для забезпечення модульності, зручності супроводу, тестування та читання коду.</w:t>
+        <w:t>Для модульності, повторного використання, тестування та супроводу.</w:t>
       </w:r>
     </w:p>
     <w:p>
@@ -1618,7 +1596,7 @@
           <w:rFonts w:ascii="Times New Roman" w:hAnsi="Times New Roman"/>
           <w:b w:val="0"/>
         </w:rPr>
-        <w:t>Реалізація правил предметної області та алгоритмів обробки даних.</w:t>
+        <w:t>Правила та обчислення предметної області.</w:t>
       </w:r>
     </w:p>
     <w:p>
@@ -1644,7 +1622,7 @@
           <w:rFonts w:ascii="Times New Roman" w:hAnsi="Times New Roman"/>
           <w:b w:val="0"/>
         </w:rPr>
-        <w:t>Щоб бізнес-логіку можна було повторно використовувати, тестувати та змінювати інтерфейс без переписування правил.</w:t>
+        <w:t>Щоб логіку було легше тестувати, повторно використовувати та підключати до інших інтерфейсів.</w:t>
       </w:r>
     </w:p>
     <w:p>
@@ -1670,7 +1648,7 @@
           <w:rFonts w:ascii="Times New Roman" w:hAnsi="Times New Roman"/>
           <w:b w:val="0"/>
         </w:rPr>
-        <w:t>У лабораторній роботі реалізовано консольний застосунок «Система бронювання готелю» за індивідуальним варіантом №8 з використанням структури src-layout. Для кожного номера визначено: номер, тип, ціна, статус бронювання. Реалізовано: список вільних номерів, бронювання, скасування бронювання, пошук найдешевшого номера, обчислення можливої виручки. Створено data model Room та власний виняток BookingError. Налаштовано pyproject.toml, .gitignore, README.md та зафіксовано історію з трьох комітів у Git-репозиторії. Отримано практичні навички професійної організації Python-проєктів.</w:t>
+        <w:t>У лабораторній роботі створено структурований Python-проєкт за src-layout для системи бронювання готелю (варіант №8). Реалізовано data model Room (номер, тип, ціна, статус бронювання), окремий модуль business logic (список вільних номерів, бронювання, скасування бронювання, пошук найдешевшого номера, обчислення можливої виручки), точку входу main.py, type hints, валідацію та автоматизовані тести. Підготовлено pyproject.toml, .gitignore і README.md, а також сформовано логічну Git-історію з трьох commits. Отримано практичні навички організації професійного Python-проєкту, роботи з virtual environment і Git.</w:t>
       </w:r>
     </w:p>
     <w:sectPr>

</xml_diff>